<commit_message>
Vektoripaja: moottori v2.7.4 saavutettava ulkoasu ennallaan
Vektoripaja käyttää nyt samaa moottoria kuin muut näyttöprojektit. Oppijan
näkövamman vuoksi suunniteltu ulkoasu (värit, koko, välit, reunat, fokus,
yksipalstaisuus) on todennetusti ennallaan: 0 tyylieroa kaikissa 32 näkymässä
leveänä ja kapeana. Uutta: vaihekuvan "Avaa kuva isona", termi "Sanat tässä
työvaiheessa", työpaketin viikoille yhteys- ja tavoiteotsikot sekä "Viikon
lopputarkistus". Ennen moottoriin kovakoodatut tekstit ovat nyt sisalto.js:ssä.
PDF:t 78 sivua kuten ennen. README kertoo teeman tarkistustavan.

Co-Authored-By: Claude Opus 5.5 <noreply@anthropic.com>
</commit_message>
<xml_diff>
--- a/vektoripaja/downloads/nayton-dokumentointipohjat.docx
+++ b/vektoripaja/downloads/nayton-dokumentointipohjat.docx
@@ -4,7 +4,7 @@
   <w:body>
     <w:p>
       <w:pPr>
-        <w:spacing w:after="120" w:before="200"/>
+        <w:spacing w:before="200" w:after="120"/>
       </w:pPr>
       <w:r>
         <w:rPr>
@@ -33,7 +33,7 @@
     <w:p>
       <w:pPr>
         <w:pStyle w:val="Heading1"/>
-        <w:spacing w:after="160" w:before="320"/>
+        <w:spacing w:before="320" w:after="160"/>
       </w:pPr>
       <w:r>
         <w:rPr>
@@ -199,7 +199,6 @@
                 <w:sz w:val="19"/>
                 <w:szCs w:val="19"/>
               </w:rPr>
-              <w:t xml:space="preserve"/>
             </w:r>
           </w:p>
         </w:tc>
@@ -222,7 +221,6 @@
                 <w:sz w:val="19"/>
                 <w:szCs w:val="19"/>
               </w:rPr>
-              <w:t xml:space="preserve"/>
             </w:r>
           </w:p>
         </w:tc>
@@ -270,7 +268,6 @@
                 <w:sz w:val="19"/>
                 <w:szCs w:val="19"/>
               </w:rPr>
-              <w:t xml:space="preserve"/>
             </w:r>
           </w:p>
         </w:tc>
@@ -293,7 +290,6 @@
                 <w:sz w:val="19"/>
                 <w:szCs w:val="19"/>
               </w:rPr>
-              <w:t xml:space="preserve"/>
             </w:r>
           </w:p>
         </w:tc>
@@ -341,7 +337,6 @@
                 <w:sz w:val="19"/>
                 <w:szCs w:val="19"/>
               </w:rPr>
-              <w:t xml:space="preserve"/>
             </w:r>
           </w:p>
         </w:tc>
@@ -364,7 +359,6 @@
                 <w:sz w:val="19"/>
                 <w:szCs w:val="19"/>
               </w:rPr>
-              <w:t xml:space="preserve"/>
             </w:r>
           </w:p>
         </w:tc>
@@ -412,7 +406,6 @@
                 <w:sz w:val="19"/>
                 <w:szCs w:val="19"/>
               </w:rPr>
-              <w:t xml:space="preserve"/>
             </w:r>
           </w:p>
         </w:tc>
@@ -435,7 +428,6 @@
                 <w:sz w:val="19"/>
                 <w:szCs w:val="19"/>
               </w:rPr>
-              <w:t xml:space="preserve"/>
             </w:r>
           </w:p>
         </w:tc>
@@ -483,7 +475,6 @@
                 <w:sz w:val="19"/>
                 <w:szCs w:val="19"/>
               </w:rPr>
-              <w:t xml:space="preserve"/>
             </w:r>
           </w:p>
         </w:tc>
@@ -506,7 +497,6 @@
                 <w:sz w:val="19"/>
                 <w:szCs w:val="19"/>
               </w:rPr>
-              <w:t xml:space="preserve"/>
             </w:r>
           </w:p>
         </w:tc>
@@ -554,7 +544,6 @@
                 <w:sz w:val="19"/>
                 <w:szCs w:val="19"/>
               </w:rPr>
-              <w:t xml:space="preserve"/>
             </w:r>
           </w:p>
         </w:tc>
@@ -577,7 +566,6 @@
                 <w:sz w:val="19"/>
                 <w:szCs w:val="19"/>
               </w:rPr>
-              <w:t xml:space="preserve"/>
             </w:r>
           </w:p>
         </w:tc>
@@ -591,7 +579,7 @@
     <w:p>
       <w:pPr>
         <w:pStyle w:val="Heading1"/>
-        <w:spacing w:after="160" w:before="320"/>
+        <w:spacing w:before="320" w:after="160"/>
       </w:pPr>
       <w:r>
         <w:rPr>
@@ -775,7 +763,7 @@
           <w:sz w:val="21"/>
           <w:szCs w:val="21"/>
         </w:rPr>
-        <w:t xml:space="preserve">Keskustelukumppani, rooli ja pvm:</w:t>
+        <w:t xml:space="preserve">Keskustelukumppanin rooli (ei nimeä) ja pvm:</w:t>
       </w:r>
     </w:p>
     <w:p>
@@ -799,7 +787,7 @@
     <w:p>
       <w:pPr>
         <w:pStyle w:val="Heading1"/>
-        <w:spacing w:after="160" w:before="320"/>
+        <w:spacing w:before="320" w:after="160"/>
       </w:pPr>
       <w:r>
         <w:rPr>
@@ -872,7 +860,6 @@
                 <w:sz w:val="19"/>
                 <w:szCs w:val="19"/>
               </w:rPr>
-              <w:t xml:space="preserve"/>
             </w:r>
           </w:p>
         </w:tc>
@@ -900,7 +887,7 @@
                 <w:sz w:val="19"/>
                 <w:szCs w:val="19"/>
               </w:rPr>
-              <w:t xml:space="preserve">Osallistujat ja roolit</w:t>
+              <w:t xml:space="preserve">Osallistujien roolit (ei nimiä)</w:t>
             </w:r>
           </w:p>
         </w:tc>
@@ -923,7 +910,6 @@
                 <w:sz w:val="19"/>
                 <w:szCs w:val="19"/>
               </w:rPr>
-              <w:t xml:space="preserve"/>
             </w:r>
           </w:p>
         </w:tc>
@@ -951,7 +937,7 @@
                 <w:sz w:val="19"/>
                 <w:szCs w:val="19"/>
               </w:rPr>
-              <w:t xml:space="preserve">Testaajan alkuperäinen havainto (hänen sanoillaan)</w:t>
+              <w:t xml:space="preserve">Testaajan havainto hänen sanoillaan (merkitse rooli, ei nimeä)</w:t>
             </w:r>
           </w:p>
         </w:tc>
@@ -974,7 +960,6 @@
                 <w:sz w:val="19"/>
                 <w:szCs w:val="19"/>
               </w:rPr>
-              <w:t xml:space="preserve"/>
             </w:r>
           </w:p>
         </w:tc>
@@ -1025,7 +1010,6 @@
                 <w:sz w:val="19"/>
                 <w:szCs w:val="19"/>
               </w:rPr>
-              <w:t xml:space="preserve"/>
             </w:r>
           </w:p>
         </w:tc>
@@ -1076,7 +1060,6 @@
                 <w:sz w:val="19"/>
                 <w:szCs w:val="19"/>
               </w:rPr>
-              <w:t xml:space="preserve"/>
             </w:r>
           </w:p>
         </w:tc>
@@ -1127,7 +1110,6 @@
                 <w:sz w:val="19"/>
                 <w:szCs w:val="19"/>
               </w:rPr>
-              <w:t xml:space="preserve"/>
             </w:r>
           </w:p>
         </w:tc>
@@ -1145,7 +1127,7 @@
           <w:sz w:val="21"/>
           <w:szCs w:val="21"/>
         </w:rPr>
-        <w:t xml:space="preserve">Erota aina testaajan sanat omasta tulkinnastasi.</w:t>
+        <w:t xml:space="preserve">Erota aina testaajan sanat omasta tulkinnastasi. Julkiseen repositoryyn kirjataan henkilöistä vain rooli; nimet ohjaajalle Teamsissa tarvittaessa.</w:t>
       </w:r>
     </w:p>
     <w:p>
@@ -1156,7 +1138,7 @@
     <w:p>
       <w:pPr>
         <w:pStyle w:val="Heading1"/>
-        <w:spacing w:after="160" w:before="320"/>
+        <w:spacing w:before="320" w:after="160"/>
       </w:pPr>
       <w:r>
         <w:rPr>
@@ -1391,7 +1373,6 @@
                 <w:sz w:val="19"/>
                 <w:szCs w:val="19"/>
               </w:rPr>
-              <w:t xml:space="preserve"/>
             </w:r>
           </w:p>
         </w:tc>
@@ -1414,7 +1395,6 @@
                 <w:sz w:val="19"/>
                 <w:szCs w:val="19"/>
               </w:rPr>
-              <w:t xml:space="preserve"/>
             </w:r>
           </w:p>
         </w:tc>
@@ -1437,7 +1417,6 @@
                 <w:sz w:val="19"/>
                 <w:szCs w:val="19"/>
               </w:rPr>
-              <w:t xml:space="preserve"/>
             </w:r>
           </w:p>
         </w:tc>
@@ -1460,7 +1439,6 @@
                 <w:sz w:val="19"/>
                 <w:szCs w:val="19"/>
               </w:rPr>
-              <w:t xml:space="preserve"/>
             </w:r>
           </w:p>
         </w:tc>
@@ -1483,7 +1461,6 @@
                 <w:sz w:val="19"/>
                 <w:szCs w:val="19"/>
               </w:rPr>
-              <w:t xml:space="preserve"/>
             </w:r>
           </w:p>
         </w:tc>
@@ -1531,7 +1508,6 @@
                 <w:sz w:val="19"/>
                 <w:szCs w:val="19"/>
               </w:rPr>
-              <w:t xml:space="preserve"/>
             </w:r>
           </w:p>
         </w:tc>
@@ -1554,7 +1530,6 @@
                 <w:sz w:val="19"/>
                 <w:szCs w:val="19"/>
               </w:rPr>
-              <w:t xml:space="preserve"/>
             </w:r>
           </w:p>
         </w:tc>
@@ -1577,7 +1552,6 @@
                 <w:sz w:val="19"/>
                 <w:szCs w:val="19"/>
               </w:rPr>
-              <w:t xml:space="preserve"/>
             </w:r>
           </w:p>
         </w:tc>
@@ -1600,7 +1574,6 @@
                 <w:sz w:val="19"/>
                 <w:szCs w:val="19"/>
               </w:rPr>
-              <w:t xml:space="preserve"/>
             </w:r>
           </w:p>
         </w:tc>
@@ -1623,7 +1596,6 @@
                 <w:sz w:val="19"/>
                 <w:szCs w:val="19"/>
               </w:rPr>
-              <w:t xml:space="preserve"/>
             </w:r>
           </w:p>
         </w:tc>
@@ -1671,7 +1643,6 @@
                 <w:sz w:val="19"/>
                 <w:szCs w:val="19"/>
               </w:rPr>
-              <w:t xml:space="preserve"/>
             </w:r>
           </w:p>
         </w:tc>
@@ -1694,7 +1665,6 @@
                 <w:sz w:val="19"/>
                 <w:szCs w:val="19"/>
               </w:rPr>
-              <w:t xml:space="preserve"/>
             </w:r>
           </w:p>
         </w:tc>
@@ -1717,7 +1687,6 @@
                 <w:sz w:val="19"/>
                 <w:szCs w:val="19"/>
               </w:rPr>
-              <w:t xml:space="preserve"/>
             </w:r>
           </w:p>
         </w:tc>
@@ -1740,7 +1709,6 @@
                 <w:sz w:val="19"/>
                 <w:szCs w:val="19"/>
               </w:rPr>
-              <w:t xml:space="preserve"/>
             </w:r>
           </w:p>
         </w:tc>
@@ -1763,7 +1731,6 @@
                 <w:sz w:val="19"/>
                 <w:szCs w:val="19"/>
               </w:rPr>
-              <w:t xml:space="preserve"/>
             </w:r>
           </w:p>
         </w:tc>
@@ -1811,7 +1778,6 @@
                 <w:sz w:val="19"/>
                 <w:szCs w:val="19"/>
               </w:rPr>
-              <w:t xml:space="preserve"/>
             </w:r>
           </w:p>
         </w:tc>
@@ -1834,7 +1800,6 @@
                 <w:sz w:val="19"/>
                 <w:szCs w:val="19"/>
               </w:rPr>
-              <w:t xml:space="preserve"/>
             </w:r>
           </w:p>
         </w:tc>
@@ -1857,7 +1822,6 @@
                 <w:sz w:val="19"/>
                 <w:szCs w:val="19"/>
               </w:rPr>
-              <w:t xml:space="preserve"/>
             </w:r>
           </w:p>
         </w:tc>
@@ -1880,7 +1844,6 @@
                 <w:sz w:val="19"/>
                 <w:szCs w:val="19"/>
               </w:rPr>
-              <w:t xml:space="preserve"/>
             </w:r>
           </w:p>
         </w:tc>
@@ -1903,7 +1866,6 @@
                 <w:sz w:val="19"/>
                 <w:szCs w:val="19"/>
               </w:rPr>
-              <w:t xml:space="preserve"/>
             </w:r>
           </w:p>
         </w:tc>
@@ -1951,7 +1913,6 @@
                 <w:sz w:val="19"/>
                 <w:szCs w:val="19"/>
               </w:rPr>
-              <w:t xml:space="preserve"/>
             </w:r>
           </w:p>
         </w:tc>
@@ -1974,7 +1935,6 @@
                 <w:sz w:val="19"/>
                 <w:szCs w:val="19"/>
               </w:rPr>
-              <w:t xml:space="preserve"/>
             </w:r>
           </w:p>
         </w:tc>
@@ -1997,7 +1957,6 @@
                 <w:sz w:val="19"/>
                 <w:szCs w:val="19"/>
               </w:rPr>
-              <w:t xml:space="preserve"/>
             </w:r>
           </w:p>
         </w:tc>
@@ -2020,7 +1979,6 @@
                 <w:sz w:val="19"/>
                 <w:szCs w:val="19"/>
               </w:rPr>
-              <w:t xml:space="preserve"/>
             </w:r>
           </w:p>
         </w:tc>
@@ -2043,7 +2001,6 @@
                 <w:sz w:val="19"/>
                 <w:szCs w:val="19"/>
               </w:rPr>
-              <w:t xml:space="preserve"/>
             </w:r>
           </w:p>
         </w:tc>
@@ -2091,7 +2048,6 @@
                 <w:sz w:val="19"/>
                 <w:szCs w:val="19"/>
               </w:rPr>
-              <w:t xml:space="preserve"/>
             </w:r>
           </w:p>
         </w:tc>
@@ -2114,7 +2070,6 @@
                 <w:sz w:val="19"/>
                 <w:szCs w:val="19"/>
               </w:rPr>
-              <w:t xml:space="preserve"/>
             </w:r>
           </w:p>
         </w:tc>
@@ -2137,7 +2092,6 @@
                 <w:sz w:val="19"/>
                 <w:szCs w:val="19"/>
               </w:rPr>
-              <w:t xml:space="preserve"/>
             </w:r>
           </w:p>
         </w:tc>
@@ -2160,7 +2114,6 @@
                 <w:sz w:val="19"/>
                 <w:szCs w:val="19"/>
               </w:rPr>
-              <w:t xml:space="preserve"/>
             </w:r>
           </w:p>
         </w:tc>
@@ -2183,7 +2136,6 @@
                 <w:sz w:val="19"/>
                 <w:szCs w:val="19"/>
               </w:rPr>
-              <w:t xml:space="preserve"/>
             </w:r>
           </w:p>
         </w:tc>
@@ -2231,7 +2183,6 @@
                 <w:sz w:val="19"/>
                 <w:szCs w:val="19"/>
               </w:rPr>
-              <w:t xml:space="preserve"/>
             </w:r>
           </w:p>
         </w:tc>
@@ -2254,7 +2205,6 @@
                 <w:sz w:val="19"/>
                 <w:szCs w:val="19"/>
               </w:rPr>
-              <w:t xml:space="preserve"/>
             </w:r>
           </w:p>
         </w:tc>
@@ -2277,7 +2227,6 @@
                 <w:sz w:val="19"/>
                 <w:szCs w:val="19"/>
               </w:rPr>
-              <w:t xml:space="preserve"/>
             </w:r>
           </w:p>
         </w:tc>
@@ -2300,7 +2249,6 @@
                 <w:sz w:val="19"/>
                 <w:szCs w:val="19"/>
               </w:rPr>
-              <w:t xml:space="preserve"/>
             </w:r>
           </w:p>
         </w:tc>
@@ -2323,7 +2271,6 @@
                 <w:sz w:val="19"/>
                 <w:szCs w:val="19"/>
               </w:rPr>
-              <w:t xml:space="preserve"/>
             </w:r>
           </w:p>
         </w:tc>
@@ -2371,7 +2318,6 @@
                 <w:sz w:val="19"/>
                 <w:szCs w:val="19"/>
               </w:rPr>
-              <w:t xml:space="preserve"/>
             </w:r>
           </w:p>
         </w:tc>
@@ -2394,7 +2340,6 @@
                 <w:sz w:val="19"/>
                 <w:szCs w:val="19"/>
               </w:rPr>
-              <w:t xml:space="preserve"/>
             </w:r>
           </w:p>
         </w:tc>
@@ -2417,7 +2362,6 @@
                 <w:sz w:val="19"/>
                 <w:szCs w:val="19"/>
               </w:rPr>
-              <w:t xml:space="preserve"/>
             </w:r>
           </w:p>
         </w:tc>
@@ -2440,7 +2384,6 @@
                 <w:sz w:val="19"/>
                 <w:szCs w:val="19"/>
               </w:rPr>
-              <w:t xml:space="preserve"/>
             </w:r>
           </w:p>
         </w:tc>
@@ -2463,7 +2406,6 @@
                 <w:sz w:val="19"/>
                 <w:szCs w:val="19"/>
               </w:rPr>
-              <w:t xml:space="preserve"/>
             </w:r>
           </w:p>
         </w:tc>
@@ -2511,7 +2453,6 @@
                 <w:sz w:val="19"/>
                 <w:szCs w:val="19"/>
               </w:rPr>
-              <w:t xml:space="preserve"/>
             </w:r>
           </w:p>
         </w:tc>
@@ -2534,7 +2475,6 @@
                 <w:sz w:val="19"/>
                 <w:szCs w:val="19"/>
               </w:rPr>
-              <w:t xml:space="preserve"/>
             </w:r>
           </w:p>
         </w:tc>
@@ -2557,7 +2497,6 @@
                 <w:sz w:val="19"/>
                 <w:szCs w:val="19"/>
               </w:rPr>
-              <w:t xml:space="preserve"/>
             </w:r>
           </w:p>
         </w:tc>
@@ -2580,7 +2519,6 @@
                 <w:sz w:val="19"/>
                 <w:szCs w:val="19"/>
               </w:rPr>
-              <w:t xml:space="preserve"/>
             </w:r>
           </w:p>
         </w:tc>
@@ -2603,7 +2541,6 @@
                 <w:sz w:val="19"/>
                 <w:szCs w:val="19"/>
               </w:rPr>
-              <w:t xml:space="preserve"/>
             </w:r>
           </w:p>
         </w:tc>
@@ -2651,7 +2588,6 @@
                 <w:sz w:val="19"/>
                 <w:szCs w:val="19"/>
               </w:rPr>
-              <w:t xml:space="preserve"/>
             </w:r>
           </w:p>
         </w:tc>
@@ -2674,7 +2610,6 @@
                 <w:sz w:val="19"/>
                 <w:szCs w:val="19"/>
               </w:rPr>
-              <w:t xml:space="preserve"/>
             </w:r>
           </w:p>
         </w:tc>
@@ -2697,7 +2632,6 @@
                 <w:sz w:val="19"/>
                 <w:szCs w:val="19"/>
               </w:rPr>
-              <w:t xml:space="preserve"/>
             </w:r>
           </w:p>
         </w:tc>
@@ -2720,7 +2654,6 @@
                 <w:sz w:val="19"/>
                 <w:szCs w:val="19"/>
               </w:rPr>
-              <w:t xml:space="preserve"/>
             </w:r>
           </w:p>
         </w:tc>
@@ -2743,7 +2676,6 @@
                 <w:sz w:val="19"/>
                 <w:szCs w:val="19"/>
               </w:rPr>
-              <w:t xml:space="preserve"/>
             </w:r>
           </w:p>
         </w:tc>
@@ -2791,7 +2723,6 @@
                 <w:sz w:val="19"/>
                 <w:szCs w:val="19"/>
               </w:rPr>
-              <w:t xml:space="preserve"/>
             </w:r>
           </w:p>
         </w:tc>
@@ -2814,7 +2745,6 @@
                 <w:sz w:val="19"/>
                 <w:szCs w:val="19"/>
               </w:rPr>
-              <w:t xml:space="preserve"/>
             </w:r>
           </w:p>
         </w:tc>
@@ -2837,7 +2767,6 @@
                 <w:sz w:val="19"/>
                 <w:szCs w:val="19"/>
               </w:rPr>
-              <w:t xml:space="preserve"/>
             </w:r>
           </w:p>
         </w:tc>
@@ -2860,7 +2789,6 @@
                 <w:sz w:val="19"/>
                 <w:szCs w:val="19"/>
               </w:rPr>
-              <w:t xml:space="preserve"/>
             </w:r>
           </w:p>
         </w:tc>
@@ -2883,7 +2811,6 @@
                 <w:sz w:val="19"/>
                 <w:szCs w:val="19"/>
               </w:rPr>
-              <w:t xml:space="preserve"/>
             </w:r>
           </w:p>
         </w:tc>
@@ -2931,7 +2858,6 @@
                 <w:sz w:val="19"/>
                 <w:szCs w:val="19"/>
               </w:rPr>
-              <w:t xml:space="preserve"/>
             </w:r>
           </w:p>
         </w:tc>
@@ -2954,7 +2880,6 @@
                 <w:sz w:val="19"/>
                 <w:szCs w:val="19"/>
               </w:rPr>
-              <w:t xml:space="preserve"/>
             </w:r>
           </w:p>
         </w:tc>
@@ -2977,7 +2902,6 @@
                 <w:sz w:val="19"/>
                 <w:szCs w:val="19"/>
               </w:rPr>
-              <w:t xml:space="preserve"/>
             </w:r>
           </w:p>
         </w:tc>
@@ -3000,7 +2924,6 @@
                 <w:sz w:val="19"/>
                 <w:szCs w:val="19"/>
               </w:rPr>
-              <w:t xml:space="preserve"/>
             </w:r>
           </w:p>
         </w:tc>
@@ -3023,7 +2946,6 @@
                 <w:sz w:val="19"/>
                 <w:szCs w:val="19"/>
               </w:rPr>
-              <w:t xml:space="preserve"/>
             </w:r>
           </w:p>
         </w:tc>
@@ -3071,7 +2993,6 @@
                 <w:sz w:val="19"/>
                 <w:szCs w:val="19"/>
               </w:rPr>
-              <w:t xml:space="preserve"/>
             </w:r>
           </w:p>
         </w:tc>
@@ -3094,7 +3015,6 @@
                 <w:sz w:val="19"/>
                 <w:szCs w:val="19"/>
               </w:rPr>
-              <w:t xml:space="preserve"/>
             </w:r>
           </w:p>
         </w:tc>
@@ -3117,7 +3037,6 @@
                 <w:sz w:val="19"/>
                 <w:szCs w:val="19"/>
               </w:rPr>
-              <w:t xml:space="preserve"/>
             </w:r>
           </w:p>
         </w:tc>
@@ -3140,7 +3059,6 @@
                 <w:sz w:val="19"/>
                 <w:szCs w:val="19"/>
               </w:rPr>
-              <w:t xml:space="preserve"/>
             </w:r>
           </w:p>
         </w:tc>
@@ -3163,7 +3081,6 @@
                 <w:sz w:val="19"/>
                 <w:szCs w:val="19"/>
               </w:rPr>
-              <w:t xml:space="preserve"/>
             </w:r>
           </w:p>
         </w:tc>
@@ -3211,7 +3128,6 @@
                 <w:sz w:val="19"/>
                 <w:szCs w:val="19"/>
               </w:rPr>
-              <w:t xml:space="preserve"/>
             </w:r>
           </w:p>
         </w:tc>
@@ -3234,7 +3150,6 @@
                 <w:sz w:val="19"/>
                 <w:szCs w:val="19"/>
               </w:rPr>
-              <w:t xml:space="preserve"/>
             </w:r>
           </w:p>
         </w:tc>
@@ -3257,7 +3172,6 @@
                 <w:sz w:val="19"/>
                 <w:szCs w:val="19"/>
               </w:rPr>
-              <w:t xml:space="preserve"/>
             </w:r>
           </w:p>
         </w:tc>
@@ -3280,7 +3194,6 @@
                 <w:sz w:val="19"/>
                 <w:szCs w:val="19"/>
               </w:rPr>
-              <w:t xml:space="preserve"/>
             </w:r>
           </w:p>
         </w:tc>
@@ -3303,7 +3216,6 @@
                 <w:sz w:val="19"/>
                 <w:szCs w:val="19"/>
               </w:rPr>
-              <w:t xml:space="preserve"/>
             </w:r>
           </w:p>
         </w:tc>
@@ -3351,7 +3263,6 @@
                 <w:sz w:val="19"/>
                 <w:szCs w:val="19"/>
               </w:rPr>
-              <w:t xml:space="preserve"/>
             </w:r>
           </w:p>
         </w:tc>
@@ -3374,7 +3285,6 @@
                 <w:sz w:val="19"/>
                 <w:szCs w:val="19"/>
               </w:rPr>
-              <w:t xml:space="preserve"/>
             </w:r>
           </w:p>
         </w:tc>
@@ -3397,7 +3307,6 @@
                 <w:sz w:val="19"/>
                 <w:szCs w:val="19"/>
               </w:rPr>
-              <w:t xml:space="preserve"/>
             </w:r>
           </w:p>
         </w:tc>
@@ -3420,7 +3329,6 @@
                 <w:sz w:val="19"/>
                 <w:szCs w:val="19"/>
               </w:rPr>
-              <w:t xml:space="preserve"/>
             </w:r>
           </w:p>
         </w:tc>
@@ -3443,7 +3351,6 @@
                 <w:sz w:val="19"/>
                 <w:szCs w:val="19"/>
               </w:rPr>
-              <w:t xml:space="preserve"/>
             </w:r>
           </w:p>
         </w:tc>
@@ -3491,7 +3398,6 @@
                 <w:sz w:val="19"/>
                 <w:szCs w:val="19"/>
               </w:rPr>
-              <w:t xml:space="preserve"/>
             </w:r>
           </w:p>
         </w:tc>
@@ -3514,7 +3420,6 @@
                 <w:sz w:val="19"/>
                 <w:szCs w:val="19"/>
               </w:rPr>
-              <w:t xml:space="preserve"/>
             </w:r>
           </w:p>
         </w:tc>
@@ -3537,7 +3442,6 @@
                 <w:sz w:val="19"/>
                 <w:szCs w:val="19"/>
               </w:rPr>
-              <w:t xml:space="preserve"/>
             </w:r>
           </w:p>
         </w:tc>
@@ -3560,7 +3464,6 @@
                 <w:sz w:val="19"/>
                 <w:szCs w:val="19"/>
               </w:rPr>
-              <w:t xml:space="preserve"/>
             </w:r>
           </w:p>
         </w:tc>
@@ -3583,7 +3486,6 @@
                 <w:sz w:val="19"/>
                 <w:szCs w:val="19"/>
               </w:rPr>
-              <w:t xml:space="preserve"/>
             </w:r>
           </w:p>
         </w:tc>
@@ -3631,7 +3533,6 @@
                 <w:sz w:val="19"/>
                 <w:szCs w:val="19"/>
               </w:rPr>
-              <w:t xml:space="preserve"/>
             </w:r>
           </w:p>
         </w:tc>
@@ -3654,7 +3555,6 @@
                 <w:sz w:val="19"/>
                 <w:szCs w:val="19"/>
               </w:rPr>
-              <w:t xml:space="preserve"/>
             </w:r>
           </w:p>
         </w:tc>
@@ -3677,7 +3577,6 @@
                 <w:sz w:val="19"/>
                 <w:szCs w:val="19"/>
               </w:rPr>
-              <w:t xml:space="preserve"/>
             </w:r>
           </w:p>
         </w:tc>
@@ -3700,7 +3599,6 @@
                 <w:sz w:val="19"/>
                 <w:szCs w:val="19"/>
               </w:rPr>
-              <w:t xml:space="preserve"/>
             </w:r>
           </w:p>
         </w:tc>
@@ -3723,7 +3621,6 @@
                 <w:sz w:val="19"/>
                 <w:szCs w:val="19"/>
               </w:rPr>
-              <w:t xml:space="preserve"/>
             </w:r>
           </w:p>
         </w:tc>
@@ -3771,7 +3668,6 @@
                 <w:sz w:val="19"/>
                 <w:szCs w:val="19"/>
               </w:rPr>
-              <w:t xml:space="preserve"/>
             </w:r>
           </w:p>
         </w:tc>
@@ -3794,7 +3690,6 @@
                 <w:sz w:val="19"/>
                 <w:szCs w:val="19"/>
               </w:rPr>
-              <w:t xml:space="preserve"/>
             </w:r>
           </w:p>
         </w:tc>
@@ -3817,7 +3712,6 @@
                 <w:sz w:val="19"/>
                 <w:szCs w:val="19"/>
               </w:rPr>
-              <w:t xml:space="preserve"/>
             </w:r>
           </w:p>
         </w:tc>
@@ -3840,7 +3734,6 @@
                 <w:sz w:val="19"/>
                 <w:szCs w:val="19"/>
               </w:rPr>
-              <w:t xml:space="preserve"/>
             </w:r>
           </w:p>
         </w:tc>
@@ -3863,7 +3756,6 @@
                 <w:sz w:val="19"/>
                 <w:szCs w:val="19"/>
               </w:rPr>
-              <w:t xml:space="preserve"/>
             </w:r>
           </w:p>
         </w:tc>
@@ -3911,7 +3803,6 @@
                 <w:sz w:val="19"/>
                 <w:szCs w:val="19"/>
               </w:rPr>
-              <w:t xml:space="preserve"/>
             </w:r>
           </w:p>
         </w:tc>
@@ -3934,7 +3825,6 @@
                 <w:sz w:val="19"/>
                 <w:szCs w:val="19"/>
               </w:rPr>
-              <w:t xml:space="preserve"/>
             </w:r>
           </w:p>
         </w:tc>
@@ -3957,7 +3847,6 @@
                 <w:sz w:val="19"/>
                 <w:szCs w:val="19"/>
               </w:rPr>
-              <w:t xml:space="preserve"/>
             </w:r>
           </w:p>
         </w:tc>
@@ -3980,7 +3869,6 @@
                 <w:sz w:val="19"/>
                 <w:szCs w:val="19"/>
               </w:rPr>
-              <w:t xml:space="preserve"/>
             </w:r>
           </w:p>
         </w:tc>
@@ -4003,7 +3891,6 @@
                 <w:sz w:val="19"/>
                 <w:szCs w:val="19"/>
               </w:rPr>
-              <w:t xml:space="preserve"/>
             </w:r>
           </w:p>
         </w:tc>
@@ -4051,7 +3938,6 @@
                 <w:sz w:val="19"/>
                 <w:szCs w:val="19"/>
               </w:rPr>
-              <w:t xml:space="preserve"/>
             </w:r>
           </w:p>
         </w:tc>
@@ -4074,7 +3960,6 @@
                 <w:sz w:val="19"/>
                 <w:szCs w:val="19"/>
               </w:rPr>
-              <w:t xml:space="preserve"/>
             </w:r>
           </w:p>
         </w:tc>
@@ -4097,7 +3982,6 @@
                 <w:sz w:val="19"/>
                 <w:szCs w:val="19"/>
               </w:rPr>
-              <w:t xml:space="preserve"/>
             </w:r>
           </w:p>
         </w:tc>
@@ -4120,7 +4004,6 @@
                 <w:sz w:val="19"/>
                 <w:szCs w:val="19"/>
               </w:rPr>
-              <w:t xml:space="preserve"/>
             </w:r>
           </w:p>
         </w:tc>
@@ -4143,7 +4026,6 @@
                 <w:sz w:val="19"/>
                 <w:szCs w:val="19"/>
               </w:rPr>
-              <w:t xml:space="preserve"/>
             </w:r>
           </w:p>
         </w:tc>
@@ -4191,7 +4073,6 @@
                 <w:sz w:val="19"/>
                 <w:szCs w:val="19"/>
               </w:rPr>
-              <w:t xml:space="preserve"/>
             </w:r>
           </w:p>
         </w:tc>
@@ -4214,7 +4095,6 @@
                 <w:sz w:val="19"/>
                 <w:szCs w:val="19"/>
               </w:rPr>
-              <w:t xml:space="preserve"/>
             </w:r>
           </w:p>
         </w:tc>
@@ -4237,7 +4117,6 @@
                 <w:sz w:val="19"/>
                 <w:szCs w:val="19"/>
               </w:rPr>
-              <w:t xml:space="preserve"/>
             </w:r>
           </w:p>
         </w:tc>
@@ -4260,7 +4139,6 @@
                 <w:sz w:val="19"/>
                 <w:szCs w:val="19"/>
               </w:rPr>
-              <w:t xml:space="preserve"/>
             </w:r>
           </w:p>
         </w:tc>
@@ -4283,7 +4161,6 @@
                 <w:sz w:val="19"/>
                 <w:szCs w:val="19"/>
               </w:rPr>
-              <w:t xml:space="preserve"/>
             </w:r>
           </w:p>
         </w:tc>
@@ -4331,7 +4208,6 @@
                 <w:sz w:val="19"/>
                 <w:szCs w:val="19"/>
               </w:rPr>
-              <w:t xml:space="preserve"/>
             </w:r>
           </w:p>
         </w:tc>
@@ -4354,7 +4230,6 @@
                 <w:sz w:val="19"/>
                 <w:szCs w:val="19"/>
               </w:rPr>
-              <w:t xml:space="preserve"/>
             </w:r>
           </w:p>
         </w:tc>
@@ -4377,7 +4252,6 @@
                 <w:sz w:val="19"/>
                 <w:szCs w:val="19"/>
               </w:rPr>
-              <w:t xml:space="preserve"/>
             </w:r>
           </w:p>
         </w:tc>
@@ -4400,7 +4274,6 @@
                 <w:sz w:val="19"/>
                 <w:szCs w:val="19"/>
               </w:rPr>
-              <w:t xml:space="preserve"/>
             </w:r>
           </w:p>
         </w:tc>
@@ -4423,7 +4296,6 @@
                 <w:sz w:val="19"/>
                 <w:szCs w:val="19"/>
               </w:rPr>
-              <w:t xml:space="preserve"/>
             </w:r>
           </w:p>
         </w:tc>
@@ -4471,7 +4343,6 @@
                 <w:sz w:val="19"/>
                 <w:szCs w:val="19"/>
               </w:rPr>
-              <w:t xml:space="preserve"/>
             </w:r>
           </w:p>
         </w:tc>
@@ -4494,7 +4365,6 @@
                 <w:sz w:val="19"/>
                 <w:szCs w:val="19"/>
               </w:rPr>
-              <w:t xml:space="preserve"/>
             </w:r>
           </w:p>
         </w:tc>
@@ -4517,7 +4387,6 @@
                 <w:sz w:val="19"/>
                 <w:szCs w:val="19"/>
               </w:rPr>
-              <w:t xml:space="preserve"/>
             </w:r>
           </w:p>
         </w:tc>
@@ -4540,7 +4409,6 @@
                 <w:sz w:val="19"/>
                 <w:szCs w:val="19"/>
               </w:rPr>
-              <w:t xml:space="preserve"/>
             </w:r>
           </w:p>
         </w:tc>
@@ -4563,7 +4431,6 @@
                 <w:sz w:val="19"/>
                 <w:szCs w:val="19"/>
               </w:rPr>
-              <w:t xml:space="preserve"/>
             </w:r>
           </w:p>
         </w:tc>
@@ -4611,7 +4478,6 @@
                 <w:sz w:val="19"/>
                 <w:szCs w:val="19"/>
               </w:rPr>
-              <w:t xml:space="preserve"/>
             </w:r>
           </w:p>
         </w:tc>
@@ -4634,7 +4500,6 @@
                 <w:sz w:val="19"/>
                 <w:szCs w:val="19"/>
               </w:rPr>
-              <w:t xml:space="preserve"/>
             </w:r>
           </w:p>
         </w:tc>
@@ -4657,7 +4522,6 @@
                 <w:sz w:val="19"/>
                 <w:szCs w:val="19"/>
               </w:rPr>
-              <w:t xml:space="preserve"/>
             </w:r>
           </w:p>
         </w:tc>
@@ -4680,7 +4544,6 @@
                 <w:sz w:val="19"/>
                 <w:szCs w:val="19"/>
               </w:rPr>
-              <w:t xml:space="preserve"/>
             </w:r>
           </w:p>
         </w:tc>
@@ -4703,7 +4566,6 @@
                 <w:sz w:val="19"/>
                 <w:szCs w:val="19"/>
               </w:rPr>
-              <w:t xml:space="preserve"/>
             </w:r>
           </w:p>
         </w:tc>
@@ -4751,7 +4613,6 @@
                 <w:sz w:val="19"/>
                 <w:szCs w:val="19"/>
               </w:rPr>
-              <w:t xml:space="preserve"/>
             </w:r>
           </w:p>
         </w:tc>
@@ -4774,7 +4635,6 @@
                 <w:sz w:val="19"/>
                 <w:szCs w:val="19"/>
               </w:rPr>
-              <w:t xml:space="preserve"/>
             </w:r>
           </w:p>
         </w:tc>
@@ -4797,7 +4657,6 @@
                 <w:sz w:val="19"/>
                 <w:szCs w:val="19"/>
               </w:rPr>
-              <w:t xml:space="preserve"/>
             </w:r>
           </w:p>
         </w:tc>
@@ -4820,7 +4679,6 @@
                 <w:sz w:val="19"/>
                 <w:szCs w:val="19"/>
               </w:rPr>
-              <w:t xml:space="preserve"/>
             </w:r>
           </w:p>
         </w:tc>
@@ -4843,7 +4701,6 @@
                 <w:sz w:val="19"/>
                 <w:szCs w:val="19"/>
               </w:rPr>
-              <w:t xml:space="preserve"/>
             </w:r>
           </w:p>
         </w:tc>
@@ -4891,7 +4748,6 @@
                 <w:sz w:val="19"/>
                 <w:szCs w:val="19"/>
               </w:rPr>
-              <w:t xml:space="preserve"/>
             </w:r>
           </w:p>
         </w:tc>
@@ -4914,7 +4770,6 @@
                 <w:sz w:val="19"/>
                 <w:szCs w:val="19"/>
               </w:rPr>
-              <w:t xml:space="preserve"/>
             </w:r>
           </w:p>
         </w:tc>
@@ -4937,7 +4792,6 @@
                 <w:sz w:val="19"/>
                 <w:szCs w:val="19"/>
               </w:rPr>
-              <w:t xml:space="preserve"/>
             </w:r>
           </w:p>
         </w:tc>
@@ -4960,7 +4814,6 @@
                 <w:sz w:val="19"/>
                 <w:szCs w:val="19"/>
               </w:rPr>
-              <w:t xml:space="preserve"/>
             </w:r>
           </w:p>
         </w:tc>
@@ -4983,7 +4836,6 @@
                 <w:sz w:val="19"/>
                 <w:szCs w:val="19"/>
               </w:rPr>
-              <w:t xml:space="preserve"/>
             </w:r>
           </w:p>
         </w:tc>
@@ -5001,7 +4853,7 @@
           <w:sz w:val="21"/>
           <w:szCs w:val="21"/>
         </w:rPr>
-        <w:t xml:space="preserve">Luokat: T01–T09 normaali käyttö · T10–T18 rajat · loput virhetilanteet. Kirjoita odotus ennen testiajoa.</w:t>
+        <w:t xml:space="preserve">Merkitse jokaiselle testitapaukselle luokka: normaali käyttö, raja tai virhetilanne. Kirjoita odotus ennen testiajoa.</w:t>
       </w:r>
     </w:p>
     <w:p>
@@ -5012,7 +4864,7 @@
     <w:p>
       <w:pPr>
         <w:pStyle w:val="Heading1"/>
-        <w:spacing w:after="160" w:before="320"/>
+        <w:spacing w:before="320" w:after="160"/>
       </w:pPr>
       <w:r>
         <w:rPr>
@@ -5193,7 +5045,7 @@
     <w:p>
       <w:pPr>
         <w:pStyle w:val="Heading1"/>
-        <w:spacing w:after="160" w:before="320"/>
+        <w:spacing w:before="320" w:after="160"/>
       </w:pPr>
       <w:r>
         <w:rPr>
@@ -5336,7 +5188,6 @@
                 <w:sz w:val="19"/>
                 <w:szCs w:val="19"/>
               </w:rPr>
-              <w:t xml:space="preserve"/>
             </w:r>
           </w:p>
         </w:tc>
@@ -5359,7 +5210,6 @@
                 <w:sz w:val="19"/>
                 <w:szCs w:val="19"/>
               </w:rPr>
-              <w:t xml:space="preserve"/>
             </w:r>
           </w:p>
         </w:tc>
@@ -5382,7 +5232,6 @@
                 <w:sz w:val="19"/>
                 <w:szCs w:val="19"/>
               </w:rPr>
-              <w:t xml:space="preserve"/>
             </w:r>
           </w:p>
         </w:tc>
@@ -5407,7 +5256,6 @@
                 <w:sz w:val="19"/>
                 <w:szCs w:val="19"/>
               </w:rPr>
-              <w:t xml:space="preserve"/>
             </w:r>
           </w:p>
         </w:tc>
@@ -5430,7 +5278,6 @@
                 <w:sz w:val="19"/>
                 <w:szCs w:val="19"/>
               </w:rPr>
-              <w:t xml:space="preserve"/>
             </w:r>
           </w:p>
         </w:tc>
@@ -5453,7 +5300,6 @@
                 <w:sz w:val="19"/>
                 <w:szCs w:val="19"/>
               </w:rPr>
-              <w:t xml:space="preserve"/>
             </w:r>
           </w:p>
         </w:tc>
@@ -5478,7 +5324,6 @@
                 <w:sz w:val="19"/>
                 <w:szCs w:val="19"/>
               </w:rPr>
-              <w:t xml:space="preserve"/>
             </w:r>
           </w:p>
         </w:tc>
@@ -5501,7 +5346,6 @@
                 <w:sz w:val="19"/>
                 <w:szCs w:val="19"/>
               </w:rPr>
-              <w:t xml:space="preserve"/>
             </w:r>
           </w:p>
         </w:tc>
@@ -5524,7 +5368,6 @@
                 <w:sz w:val="19"/>
                 <w:szCs w:val="19"/>
               </w:rPr>
-              <w:t xml:space="preserve"/>
             </w:r>
           </w:p>
         </w:tc>
@@ -5549,7 +5392,6 @@
                 <w:sz w:val="19"/>
                 <w:szCs w:val="19"/>
               </w:rPr>
-              <w:t xml:space="preserve"/>
             </w:r>
           </w:p>
         </w:tc>
@@ -5572,7 +5414,6 @@
                 <w:sz w:val="19"/>
                 <w:szCs w:val="19"/>
               </w:rPr>
-              <w:t xml:space="preserve"/>
             </w:r>
           </w:p>
         </w:tc>
@@ -5595,7 +5436,6 @@
                 <w:sz w:val="19"/>
                 <w:szCs w:val="19"/>
               </w:rPr>
-              <w:t xml:space="preserve"/>
             </w:r>
           </w:p>
         </w:tc>
@@ -5620,7 +5460,6 @@
                 <w:sz w:val="19"/>
                 <w:szCs w:val="19"/>
               </w:rPr>
-              <w:t xml:space="preserve"/>
             </w:r>
           </w:p>
         </w:tc>
@@ -5643,7 +5482,6 @@
                 <w:sz w:val="19"/>
                 <w:szCs w:val="19"/>
               </w:rPr>
-              <w:t xml:space="preserve"/>
             </w:r>
           </w:p>
         </w:tc>
@@ -5666,7 +5504,6 @@
                 <w:sz w:val="19"/>
                 <w:szCs w:val="19"/>
               </w:rPr>
-              <w:t xml:space="preserve"/>
             </w:r>
           </w:p>
         </w:tc>
@@ -5691,7 +5528,6 @@
                 <w:sz w:val="19"/>
                 <w:szCs w:val="19"/>
               </w:rPr>
-              <w:t xml:space="preserve"/>
             </w:r>
           </w:p>
         </w:tc>
@@ -5714,7 +5550,6 @@
                 <w:sz w:val="19"/>
                 <w:szCs w:val="19"/>
               </w:rPr>
-              <w:t xml:space="preserve"/>
             </w:r>
           </w:p>
         </w:tc>
@@ -5737,7 +5572,6 @@
                 <w:sz w:val="19"/>
                 <w:szCs w:val="19"/>
               </w:rPr>
-              <w:t xml:space="preserve"/>
             </w:r>
           </w:p>
         </w:tc>
@@ -5762,7 +5596,6 @@
                 <w:sz w:val="19"/>
                 <w:szCs w:val="19"/>
               </w:rPr>
-              <w:t xml:space="preserve"/>
             </w:r>
           </w:p>
         </w:tc>
@@ -5785,7 +5618,6 @@
                 <w:sz w:val="19"/>
                 <w:szCs w:val="19"/>
               </w:rPr>
-              <w:t xml:space="preserve"/>
             </w:r>
           </w:p>
         </w:tc>
@@ -5808,7 +5640,6 @@
                 <w:sz w:val="19"/>
                 <w:szCs w:val="19"/>
               </w:rPr>
-              <w:t xml:space="preserve"/>
             </w:r>
           </w:p>
         </w:tc>
@@ -5833,7 +5664,6 @@
                 <w:sz w:val="19"/>
                 <w:szCs w:val="19"/>
               </w:rPr>
-              <w:t xml:space="preserve"/>
             </w:r>
           </w:p>
         </w:tc>
@@ -5856,7 +5686,6 @@
                 <w:sz w:val="19"/>
                 <w:szCs w:val="19"/>
               </w:rPr>
-              <w:t xml:space="preserve"/>
             </w:r>
           </w:p>
         </w:tc>
@@ -5879,7 +5708,6 @@
                 <w:sz w:val="19"/>
                 <w:szCs w:val="19"/>
               </w:rPr>
-              <w:t xml:space="preserve"/>
             </w:r>
           </w:p>
         </w:tc>
@@ -5908,7 +5736,7 @@
     <w:p>
       <w:pPr>
         <w:pStyle w:val="Heading1"/>
-        <w:spacing w:after="160" w:before="320"/>
+        <w:spacing w:before="320" w:after="160"/>
       </w:pPr>
       <w:r>
         <w:rPr>
@@ -6079,7 +5907,6 @@
                 <w:sz w:val="19"/>
                 <w:szCs w:val="19"/>
               </w:rPr>
-              <w:t xml:space="preserve"/>
             </w:r>
           </w:p>
         </w:tc>
@@ -6102,7 +5929,6 @@
                 <w:sz w:val="19"/>
                 <w:szCs w:val="19"/>
               </w:rPr>
-              <w:t xml:space="preserve"/>
             </w:r>
           </w:p>
         </w:tc>
@@ -6125,7 +5951,6 @@
                 <w:sz w:val="19"/>
                 <w:szCs w:val="19"/>
               </w:rPr>
-              <w:t xml:space="preserve"/>
             </w:r>
           </w:p>
         </w:tc>
@@ -6148,7 +5973,6 @@
                 <w:sz w:val="19"/>
                 <w:szCs w:val="19"/>
               </w:rPr>
-              <w:t xml:space="preserve"/>
             </w:r>
           </w:p>
         </w:tc>
@@ -6173,7 +5997,6 @@
                 <w:sz w:val="19"/>
                 <w:szCs w:val="19"/>
               </w:rPr>
-              <w:t xml:space="preserve"/>
             </w:r>
           </w:p>
         </w:tc>
@@ -6196,7 +6019,6 @@
                 <w:sz w:val="19"/>
                 <w:szCs w:val="19"/>
               </w:rPr>
-              <w:t xml:space="preserve"/>
             </w:r>
           </w:p>
         </w:tc>
@@ -6219,7 +6041,6 @@
                 <w:sz w:val="19"/>
                 <w:szCs w:val="19"/>
               </w:rPr>
-              <w:t xml:space="preserve"/>
             </w:r>
           </w:p>
         </w:tc>
@@ -6242,7 +6063,6 @@
                 <w:sz w:val="19"/>
                 <w:szCs w:val="19"/>
               </w:rPr>
-              <w:t xml:space="preserve"/>
             </w:r>
           </w:p>
         </w:tc>
@@ -6267,7 +6087,6 @@
                 <w:sz w:val="19"/>
                 <w:szCs w:val="19"/>
               </w:rPr>
-              <w:t xml:space="preserve"/>
             </w:r>
           </w:p>
         </w:tc>
@@ -6290,7 +6109,6 @@
                 <w:sz w:val="19"/>
                 <w:szCs w:val="19"/>
               </w:rPr>
-              <w:t xml:space="preserve"/>
             </w:r>
           </w:p>
         </w:tc>
@@ -6313,7 +6131,6 @@
                 <w:sz w:val="19"/>
                 <w:szCs w:val="19"/>
               </w:rPr>
-              <w:t xml:space="preserve"/>
             </w:r>
           </w:p>
         </w:tc>
@@ -6336,7 +6153,6 @@
                 <w:sz w:val="19"/>
                 <w:szCs w:val="19"/>
               </w:rPr>
-              <w:t xml:space="preserve"/>
             </w:r>
           </w:p>
         </w:tc>
@@ -6361,7 +6177,6 @@
                 <w:sz w:val="19"/>
                 <w:szCs w:val="19"/>
               </w:rPr>
-              <w:t xml:space="preserve"/>
             </w:r>
           </w:p>
         </w:tc>
@@ -6384,7 +6199,6 @@
                 <w:sz w:val="19"/>
                 <w:szCs w:val="19"/>
               </w:rPr>
-              <w:t xml:space="preserve"/>
             </w:r>
           </w:p>
         </w:tc>
@@ -6407,7 +6221,6 @@
                 <w:sz w:val="19"/>
                 <w:szCs w:val="19"/>
               </w:rPr>
-              <w:t xml:space="preserve"/>
             </w:r>
           </w:p>
         </w:tc>
@@ -6430,7 +6243,6 @@
                 <w:sz w:val="19"/>
                 <w:szCs w:val="19"/>
               </w:rPr>
-              <w:t xml:space="preserve"/>
             </w:r>
           </w:p>
         </w:tc>
@@ -6455,7 +6267,6 @@
                 <w:sz w:val="19"/>
                 <w:szCs w:val="19"/>
               </w:rPr>
-              <w:t xml:space="preserve"/>
             </w:r>
           </w:p>
         </w:tc>
@@ -6478,7 +6289,6 @@
                 <w:sz w:val="19"/>
                 <w:szCs w:val="19"/>
               </w:rPr>
-              <w:t xml:space="preserve"/>
             </w:r>
           </w:p>
         </w:tc>
@@ -6501,7 +6311,6 @@
                 <w:sz w:val="19"/>
                 <w:szCs w:val="19"/>
               </w:rPr>
-              <w:t xml:space="preserve"/>
             </w:r>
           </w:p>
         </w:tc>
@@ -6524,7 +6333,6 @@
                 <w:sz w:val="19"/>
                 <w:szCs w:val="19"/>
               </w:rPr>
-              <w:t xml:space="preserve"/>
             </w:r>
           </w:p>
         </w:tc>
@@ -6549,7 +6357,6 @@
                 <w:sz w:val="19"/>
                 <w:szCs w:val="19"/>
               </w:rPr>
-              <w:t xml:space="preserve"/>
             </w:r>
           </w:p>
         </w:tc>
@@ -6572,7 +6379,6 @@
                 <w:sz w:val="19"/>
                 <w:szCs w:val="19"/>
               </w:rPr>
-              <w:t xml:space="preserve"/>
             </w:r>
           </w:p>
         </w:tc>
@@ -6595,7 +6401,6 @@
                 <w:sz w:val="19"/>
                 <w:szCs w:val="19"/>
               </w:rPr>
-              <w:t xml:space="preserve"/>
             </w:r>
           </w:p>
         </w:tc>
@@ -6618,7 +6423,6 @@
                 <w:sz w:val="19"/>
                 <w:szCs w:val="19"/>
               </w:rPr>
-              <w:t xml:space="preserve"/>
             </w:r>
           </w:p>
         </w:tc>
@@ -6651,43 +6455,6 @@
 
 <file path=word/comments.xml><?xml version="1.0" encoding="utf-8"?>
 <w:comments xmlns:cx="http://schemas.microsoft.com/office/drawing/2014/chartex" xmlns:cx1="http://schemas.microsoft.com/office/drawing/2015/9/8/chartex" xmlns:cx2="http://schemas.microsoft.com/office/drawing/2015/10/21/chartex" xmlns:cx3="http://schemas.microsoft.com/office/drawing/2016/5/9/chartex" xmlns:cx4="http://schemas.microsoft.com/office/drawing/2016/5/10/chartex" xmlns:cx5="http://schemas.microsoft.com/office/drawing/2016/5/11/chartex" xmlns:cx6="http://schemas.microsoft.com/office/drawing/2016/5/12/chartex" xmlns:cx7="http://schemas.microsoft.com/office/drawing/2016/5/13/chartex" xmlns:cx8="http://schemas.microsoft.com/office/drawing/2016/5/14/chartex" xmlns:mc="http://schemas.openxmlformats.org/markup-compatibility/2006" xmlns:aink="http://schemas.microsoft.com/office/drawing/2016/ink" xmlns:am3d="http://schemas.microsoft.com/office/drawing/2017/model3d" xmlns:o="urn:schemas-microsoft-com:office:office" xmlns:r="http://schemas.openxmlformats.org/officeDocument/2006/relationships" xmlns:m="http://schemas.openxmlformats.org/officeDocument/2006/math" xmlns:v="urn:schemas-microsoft-com:vml" xmlns:wp14="http://schemas.microsoft.com/office/word/2010/wordprocessingDrawing" xmlns:wp="http://schemas.openxmlformats.org/drawingml/2006/wordprocessingDrawing" xmlns:w10="urn:schemas-microsoft-com:office:word" xmlns:w="http://schemas.openxmlformats.org/wordprocessingml/2006/main" xmlns:w14="http://schemas.microsoft.com/office/word/2010/wordml" xmlns:w15="http://schemas.microsoft.com/office/word/2012/wordml" xmlns:w16cex="http://schemas.microsoft.com/office/word/2018/wordml/cex" xmlns:w16cid="http://schemas.microsoft.com/office/word/2016/wordml/cid" xmlns:w16="http://schemas.microsoft.com/office/word/2018/wordml" xmlns:w16sdtdh="http://schemas.microsoft.com/office/word/2020/wordml/sdtdatahash" xmlns:w16se="http://schemas.microsoft.com/office/word/2015/wordml/symex" xmlns:wpg="http://schemas.microsoft.com/office/word/2010/wordprocessingGroup" xmlns:wpi="http://schemas.microsoft.com/office/word/2010/wordprocessingInk" xmlns:wne="http://schemas.microsoft.com/office/word/2006/wordml" xmlns:wps="http://schemas.microsoft.com/office/word/2010/wordprocessingShape"/>
-</file>
-
-<file path=word/endnotes.xml><?xml version="1.0" encoding="utf-8"?>
-<w:endnotes xmlns:wpc="http://schemas.microsoft.com/office/word/2010/wordprocessingCanvas" xmlns:mc="http://schemas.openxmlformats.org/markup-compatibility/2006" xmlns:o="urn:schemas-microsoft-com:office:office" xmlns:r="http://schemas.openxmlformats.org/officeDocument/2006/relationships" xmlns:m="http://schemas.openxmlformats.org/officeDocument/2006/math" xmlns:v="urn:schemas-microsoft-com:vml" xmlns:wp14="http://schemas.microsoft.com/office/word/2010/wordprocessingDrawing" xmlns:wp="http://schemas.openxmlformats.org/drawingml/2006/wordprocessingDrawing" xmlns:w10="urn:schemas-microsoft-com:office:word" xmlns:w="http://schemas.openxmlformats.org/wordprocessingml/2006/main" xmlns:w14="http://schemas.microsoft.com/office/word/2010/wordml" xmlns:w15="http://schemas.microsoft.com/office/word/2012/wordml" xmlns:wpg="http://schemas.microsoft.com/office/word/2010/wordprocessingGroup" xmlns:wpi="http://schemas.microsoft.com/office/word/2010/wordprocessingInk" xmlns:wne="http://schemas.microsoft.com/office/word/2006/wordml" xmlns:wps="http://schemas.microsoft.com/office/word/2010/wordprocessingShape" mc:Ignorable="w14 w15 wp14">
-  <w:endnote w:type="separator" w:id="-1">
-    <w:p>
-      <w:pPr>
-        <w:spacing w:after="0" w:line="240" w:lineRule="auto"/>
-      </w:pPr>
-      <w:r>
-        <w:rPr>
-          <w:rStyle w:val="EndnoteReference"/>
-        </w:rPr>
-        <w:endnoteRef/>
-      </w:r>
-      <w:r>
-        <w:separator/>
-      </w:r>
-    </w:p>
-  </w:endnote>
-  <w:endnote w:type="continuationSeparator" w:id="0">
-    <w:p>
-      <w:pPr>
-        <w:spacing w:after="0" w:line="240" w:lineRule="auto"/>
-      </w:pPr>
-      <w:r>
-        <w:rPr>
-          <w:rStyle w:val="EndnoteReference"/>
-        </w:rPr>
-        <w:endnoteRef/>
-      </w:r>
-      <w:r>
-        <w:continuationSeparator/>
-      </w:r>
-    </w:p>
-  </w:endnote>
-</w:endnotes>
 </file>
 
 <file path=word/footnotes.xml><?xml version="1.0" encoding="utf-8"?>
@@ -6827,9 +6594,9 @@
   <w:docDefaults>
     <w:rPrDefault>
       <w:rPr>
-        <w:rFonts w:ascii="Calibri" w:cs="Calibri" w:eastAsia="Calibri" w:hAnsi="Calibri"/>
         <w:sz w:val="21"/>
         <w:szCs w:val="21"/>
+        <w:rFonts w:ascii="Calibri" w:cs="Calibri" w:eastAsia="Calibri" w:hAnsi="Calibri"/>
       </w:rPr>
     </w:rPrDefault>
     <w:pPrDefault/>
@@ -6927,8 +6694,8 @@
     <w:uiPriority w:val="99"/>
     <w:unhideWhenUsed/>
     <w:rPr>
+      <w:u w:val="single"/>
       <w:color w:val="0563C1"/>
-      <w:u w:val="single"/>
     </w:rPr>
   </w:style>
   <w:style w:type="character" w:styleId="FootnoteReference">
@@ -6968,42 +6735,5 @@
       <w:szCs w:val="20"/>
     </w:rPr>
   </w:style>
-  <w:style w:type="character" w:styleId="EndnoteReference">
-    <w:name w:val="endnote reference"/>
-    <w:basedOn w:val="DefaultParagraphFont"/>
-    <w:uiPriority w:val="99"/>
-    <w:semiHidden/>
-    <w:unhideWhenUsed/>
-    <w:rPr>
-      <w:vertAlign w:val="superscript"/>
-    </w:rPr>
-  </w:style>
-  <w:style w:type="paragraph" w:styleId="EndnoteText">
-    <w:name w:val="endnote text"/>
-    <w:basedOn w:val="Normal"/>
-    <w:link w:val="EndnoteTextChar"/>
-    <w:uiPriority w:val="99"/>
-    <w:semiHidden/>
-    <w:unhideWhenUsed/>
-    <w:pPr>
-      <w:spacing w:after="0" w:line="240" w:lineRule="auto"/>
-    </w:pPr>
-    <w:rPr>
-      <w:sz w:val="20"/>
-      <w:szCs w:val="20"/>
-    </w:rPr>
-  </w:style>
-  <w:style w:type="character" w:styleId="EndnoteTextChar">
-    <w:name w:val="Endnote Text Char"/>
-    <w:basedOn w:val="DefaultParagraphFont"/>
-    <w:link w:val="EndnoteText"/>
-    <w:uiPriority w:val="99"/>
-    <w:semiHidden/>
-    <w:unhideWhenUsed/>
-    <w:rPr>
-      <w:sz w:val="20"/>
-      <w:szCs w:val="20"/>
-    </w:rPr>
-  </w:style>
 </w:styles>
 </file>
</xml_diff>

<commit_message>
Vektoripaja: selkeysuudistus (moottori v2.8)
Jokainen viittaus on linkki, toistuvat taidot ovat Työtavan perusohjeissa ja
dokumentit tiedostokortteina. Jokaisessa osatehtävässä on Missä, Tee ja Näet nyt,
ja yksi osatehtävä on yksi toimenpide (125 työvaihetta, 783 osatehtävää).
Sisältö on lukutestattu ilman taustatietoa ja kielenhuollettu.

- Kirjoitus vain VS Codessa: suunnitelma, päiväkirja ja AI-loki ovat
  repositoryn project-docs-tiedostoja; selaimen vanhan tekstin siirto viikolla 41.
- Työsykli: Palaa työvaiheeseen -painike, viikkorutiini ennen työvaiheita,
  edellisen työviikon funktio rutiinissa.
- GitHub-linkit vievät opiskelijan omaan repositoryyn, jonka osoite tallentuu
  vain hänen selaimeensa (repo: "oma"). Sivulla ei ole opiskelijan osoitetta.
- Tyylitiedoston kommentti yleiseksi kaikissa projekteissa (ei vaikutusta ulkoasuun).

Co-Authored-By: Claude Opus 5.5 <noreply@anthropic.com>
</commit_message>
<xml_diff>
--- a/vektoripaja/downloads/nayton-dokumentointipohjat.docx
+++ b/vektoripaja/downloads/nayton-dokumentointipohjat.docx
@@ -4,7 +4,7 @@
   <w:body>
     <w:p>
       <w:pPr>
-        <w:spacing w:before="200" w:after="120"/>
+        <w:spacing w:after="120" w:before="200"/>
       </w:pPr>
       <w:r>
         <w:rPr>
@@ -27,13 +27,13 @@
           <w:sz w:val="22"/>
           <w:szCs w:val="22"/>
         </w:rPr>
-        <w:t xml:space="preserve">Vektoripaja · kopioi tarvitsemasi pohja project-docs-kansioon tai täytä paperilla ja skannaa. Jokainen pohja vastaa sivuston viikkotehtävää.</w:t>
+        <w:t xml:space="preserve">Vektoripaja · opettajan dokumentointipohjat paperille. Opiskelijan dokumentit ovat valmiina repositoryn tiedostoina, esimerkiksi project-docs/katselmointi.md ja project-docs/julkaisutesti.md.</w:t>
       </w:r>
     </w:p>
     <w:p>
       <w:pPr>
         <w:pStyle w:val="Heading1"/>
-        <w:spacing w:before="320" w:after="160"/>
+        <w:spacing w:after="160" w:before="320"/>
       </w:pPr>
       <w:r>
         <w:rPr>
@@ -199,6 +199,7 @@
                 <w:sz w:val="19"/>
                 <w:szCs w:val="19"/>
               </w:rPr>
+              <w:t xml:space="preserve"/>
             </w:r>
           </w:p>
         </w:tc>
@@ -221,6 +222,7 @@
                 <w:sz w:val="19"/>
                 <w:szCs w:val="19"/>
               </w:rPr>
+              <w:t xml:space="preserve"/>
             </w:r>
           </w:p>
         </w:tc>
@@ -268,6 +270,7 @@
                 <w:sz w:val="19"/>
                 <w:szCs w:val="19"/>
               </w:rPr>
+              <w:t xml:space="preserve"/>
             </w:r>
           </w:p>
         </w:tc>
@@ -290,6 +293,7 @@
                 <w:sz w:val="19"/>
                 <w:szCs w:val="19"/>
               </w:rPr>
+              <w:t xml:space="preserve"/>
             </w:r>
           </w:p>
         </w:tc>
@@ -337,6 +341,7 @@
                 <w:sz w:val="19"/>
                 <w:szCs w:val="19"/>
               </w:rPr>
+              <w:t xml:space="preserve"/>
             </w:r>
           </w:p>
         </w:tc>
@@ -359,6 +364,7 @@
                 <w:sz w:val="19"/>
                 <w:szCs w:val="19"/>
               </w:rPr>
+              <w:t xml:space="preserve"/>
             </w:r>
           </w:p>
         </w:tc>
@@ -406,6 +412,7 @@
                 <w:sz w:val="19"/>
                 <w:szCs w:val="19"/>
               </w:rPr>
+              <w:t xml:space="preserve"/>
             </w:r>
           </w:p>
         </w:tc>
@@ -428,6 +435,7 @@
                 <w:sz w:val="19"/>
                 <w:szCs w:val="19"/>
               </w:rPr>
+              <w:t xml:space="preserve"/>
             </w:r>
           </w:p>
         </w:tc>
@@ -475,6 +483,7 @@
                 <w:sz w:val="19"/>
                 <w:szCs w:val="19"/>
               </w:rPr>
+              <w:t xml:space="preserve"/>
             </w:r>
           </w:p>
         </w:tc>
@@ -497,6 +506,7 @@
                 <w:sz w:val="19"/>
                 <w:szCs w:val="19"/>
               </w:rPr>
+              <w:t xml:space="preserve"/>
             </w:r>
           </w:p>
         </w:tc>
@@ -544,6 +554,7 @@
                 <w:sz w:val="19"/>
                 <w:szCs w:val="19"/>
               </w:rPr>
+              <w:t xml:space="preserve"/>
             </w:r>
           </w:p>
         </w:tc>
@@ -566,6 +577,7 @@
                 <w:sz w:val="19"/>
                 <w:szCs w:val="19"/>
               </w:rPr>
+              <w:t xml:space="preserve"/>
             </w:r>
           </w:p>
         </w:tc>
@@ -579,7 +591,7 @@
     <w:p>
       <w:pPr>
         <w:pStyle w:val="Heading1"/>
-        <w:spacing w:before="320" w:after="160"/>
+        <w:spacing w:after="160" w:before="320"/>
       </w:pPr>
       <w:r>
         <w:rPr>
@@ -787,7 +799,7 @@
     <w:p>
       <w:pPr>
         <w:pStyle w:val="Heading1"/>
-        <w:spacing w:before="320" w:after="160"/>
+        <w:spacing w:after="160" w:before="320"/>
       </w:pPr>
       <w:r>
         <w:rPr>
@@ -860,6 +872,7 @@
                 <w:sz w:val="19"/>
                 <w:szCs w:val="19"/>
               </w:rPr>
+              <w:t xml:space="preserve"/>
             </w:r>
           </w:p>
         </w:tc>
@@ -910,6 +923,7 @@
                 <w:sz w:val="19"/>
                 <w:szCs w:val="19"/>
               </w:rPr>
+              <w:t xml:space="preserve"/>
             </w:r>
           </w:p>
         </w:tc>
@@ -960,6 +974,7 @@
                 <w:sz w:val="19"/>
                 <w:szCs w:val="19"/>
               </w:rPr>
+              <w:t xml:space="preserve"/>
             </w:r>
           </w:p>
         </w:tc>
@@ -1010,6 +1025,7 @@
                 <w:sz w:val="19"/>
                 <w:szCs w:val="19"/>
               </w:rPr>
+              <w:t xml:space="preserve"/>
             </w:r>
           </w:p>
         </w:tc>
@@ -1060,6 +1076,7 @@
                 <w:sz w:val="19"/>
                 <w:szCs w:val="19"/>
               </w:rPr>
+              <w:t xml:space="preserve"/>
             </w:r>
           </w:p>
         </w:tc>
@@ -1110,6 +1127,7 @@
                 <w:sz w:val="19"/>
                 <w:szCs w:val="19"/>
               </w:rPr>
+              <w:t xml:space="preserve"/>
             </w:r>
           </w:p>
         </w:tc>
@@ -1138,7 +1156,7 @@
     <w:p>
       <w:pPr>
         <w:pStyle w:val="Heading1"/>
-        <w:spacing w:before="320" w:after="160"/>
+        <w:spacing w:after="160" w:before="320"/>
       </w:pPr>
       <w:r>
         <w:rPr>
@@ -1373,6 +1391,7 @@
                 <w:sz w:val="19"/>
                 <w:szCs w:val="19"/>
               </w:rPr>
+              <w:t xml:space="preserve"/>
             </w:r>
           </w:p>
         </w:tc>
@@ -1395,6 +1414,7 @@
                 <w:sz w:val="19"/>
                 <w:szCs w:val="19"/>
               </w:rPr>
+              <w:t xml:space="preserve"/>
             </w:r>
           </w:p>
         </w:tc>
@@ -1417,6 +1437,7 @@
                 <w:sz w:val="19"/>
                 <w:szCs w:val="19"/>
               </w:rPr>
+              <w:t xml:space="preserve"/>
             </w:r>
           </w:p>
         </w:tc>
@@ -1439,6 +1460,7 @@
                 <w:sz w:val="19"/>
                 <w:szCs w:val="19"/>
               </w:rPr>
+              <w:t xml:space="preserve"/>
             </w:r>
           </w:p>
         </w:tc>
@@ -1461,6 +1483,7 @@
                 <w:sz w:val="19"/>
                 <w:szCs w:val="19"/>
               </w:rPr>
+              <w:t xml:space="preserve"/>
             </w:r>
           </w:p>
         </w:tc>
@@ -1508,6 +1531,7 @@
                 <w:sz w:val="19"/>
                 <w:szCs w:val="19"/>
               </w:rPr>
+              <w:t xml:space="preserve"/>
             </w:r>
           </w:p>
         </w:tc>
@@ -1530,6 +1554,7 @@
                 <w:sz w:val="19"/>
                 <w:szCs w:val="19"/>
               </w:rPr>
+              <w:t xml:space="preserve"/>
             </w:r>
           </w:p>
         </w:tc>
@@ -1552,6 +1577,7 @@
                 <w:sz w:val="19"/>
                 <w:szCs w:val="19"/>
               </w:rPr>
+              <w:t xml:space="preserve"/>
             </w:r>
           </w:p>
         </w:tc>
@@ -1574,6 +1600,7 @@
                 <w:sz w:val="19"/>
                 <w:szCs w:val="19"/>
               </w:rPr>
+              <w:t xml:space="preserve"/>
             </w:r>
           </w:p>
         </w:tc>
@@ -1596,6 +1623,7 @@
                 <w:sz w:val="19"/>
                 <w:szCs w:val="19"/>
               </w:rPr>
+              <w:t xml:space="preserve"/>
             </w:r>
           </w:p>
         </w:tc>
@@ -1643,6 +1671,7 @@
                 <w:sz w:val="19"/>
                 <w:szCs w:val="19"/>
               </w:rPr>
+              <w:t xml:space="preserve"/>
             </w:r>
           </w:p>
         </w:tc>
@@ -1665,6 +1694,7 @@
                 <w:sz w:val="19"/>
                 <w:szCs w:val="19"/>
               </w:rPr>
+              <w:t xml:space="preserve"/>
             </w:r>
           </w:p>
         </w:tc>
@@ -1687,6 +1717,7 @@
                 <w:sz w:val="19"/>
                 <w:szCs w:val="19"/>
               </w:rPr>
+              <w:t xml:space="preserve"/>
             </w:r>
           </w:p>
         </w:tc>
@@ -1709,6 +1740,7 @@
                 <w:sz w:val="19"/>
                 <w:szCs w:val="19"/>
               </w:rPr>
+              <w:t xml:space="preserve"/>
             </w:r>
           </w:p>
         </w:tc>
@@ -1731,6 +1763,7 @@
                 <w:sz w:val="19"/>
                 <w:szCs w:val="19"/>
               </w:rPr>
+              <w:t xml:space="preserve"/>
             </w:r>
           </w:p>
         </w:tc>
@@ -1778,6 +1811,7 @@
                 <w:sz w:val="19"/>
                 <w:szCs w:val="19"/>
               </w:rPr>
+              <w:t xml:space="preserve"/>
             </w:r>
           </w:p>
         </w:tc>
@@ -1800,6 +1834,7 @@
                 <w:sz w:val="19"/>
                 <w:szCs w:val="19"/>
               </w:rPr>
+              <w:t xml:space="preserve"/>
             </w:r>
           </w:p>
         </w:tc>
@@ -1822,6 +1857,7 @@
                 <w:sz w:val="19"/>
                 <w:szCs w:val="19"/>
               </w:rPr>
+              <w:t xml:space="preserve"/>
             </w:r>
           </w:p>
         </w:tc>
@@ -1844,6 +1880,7 @@
                 <w:sz w:val="19"/>
                 <w:szCs w:val="19"/>
               </w:rPr>
+              <w:t xml:space="preserve"/>
             </w:r>
           </w:p>
         </w:tc>
@@ -1866,6 +1903,7 @@
                 <w:sz w:val="19"/>
                 <w:szCs w:val="19"/>
               </w:rPr>
+              <w:t xml:space="preserve"/>
             </w:r>
           </w:p>
         </w:tc>
@@ -1913,6 +1951,7 @@
                 <w:sz w:val="19"/>
                 <w:szCs w:val="19"/>
               </w:rPr>
+              <w:t xml:space="preserve"/>
             </w:r>
           </w:p>
         </w:tc>
@@ -1935,6 +1974,7 @@
                 <w:sz w:val="19"/>
                 <w:szCs w:val="19"/>
               </w:rPr>
+              <w:t xml:space="preserve"/>
             </w:r>
           </w:p>
         </w:tc>
@@ -1957,6 +1997,7 @@
                 <w:sz w:val="19"/>
                 <w:szCs w:val="19"/>
               </w:rPr>
+              <w:t xml:space="preserve"/>
             </w:r>
           </w:p>
         </w:tc>
@@ -1979,6 +2020,7 @@
                 <w:sz w:val="19"/>
                 <w:szCs w:val="19"/>
               </w:rPr>
+              <w:t xml:space="preserve"/>
             </w:r>
           </w:p>
         </w:tc>
@@ -2001,6 +2043,7 @@
                 <w:sz w:val="19"/>
                 <w:szCs w:val="19"/>
               </w:rPr>
+              <w:t xml:space="preserve"/>
             </w:r>
           </w:p>
         </w:tc>
@@ -2048,6 +2091,7 @@
                 <w:sz w:val="19"/>
                 <w:szCs w:val="19"/>
               </w:rPr>
+              <w:t xml:space="preserve"/>
             </w:r>
           </w:p>
         </w:tc>
@@ -2070,6 +2114,7 @@
                 <w:sz w:val="19"/>
                 <w:szCs w:val="19"/>
               </w:rPr>
+              <w:t xml:space="preserve"/>
             </w:r>
           </w:p>
         </w:tc>
@@ -2092,6 +2137,7 @@
                 <w:sz w:val="19"/>
                 <w:szCs w:val="19"/>
               </w:rPr>
+              <w:t xml:space="preserve"/>
             </w:r>
           </w:p>
         </w:tc>
@@ -2114,6 +2160,7 @@
                 <w:sz w:val="19"/>
                 <w:szCs w:val="19"/>
               </w:rPr>
+              <w:t xml:space="preserve"/>
             </w:r>
           </w:p>
         </w:tc>
@@ -2136,6 +2183,7 @@
                 <w:sz w:val="19"/>
                 <w:szCs w:val="19"/>
               </w:rPr>
+              <w:t xml:space="preserve"/>
             </w:r>
           </w:p>
         </w:tc>
@@ -2183,6 +2231,7 @@
                 <w:sz w:val="19"/>
                 <w:szCs w:val="19"/>
               </w:rPr>
+              <w:t xml:space="preserve"/>
             </w:r>
           </w:p>
         </w:tc>
@@ -2205,6 +2254,7 @@
                 <w:sz w:val="19"/>
                 <w:szCs w:val="19"/>
               </w:rPr>
+              <w:t xml:space="preserve"/>
             </w:r>
           </w:p>
         </w:tc>
@@ -2227,6 +2277,7 @@
                 <w:sz w:val="19"/>
                 <w:szCs w:val="19"/>
               </w:rPr>
+              <w:t xml:space="preserve"/>
             </w:r>
           </w:p>
         </w:tc>
@@ -2249,6 +2300,7 @@
                 <w:sz w:val="19"/>
                 <w:szCs w:val="19"/>
               </w:rPr>
+              <w:t xml:space="preserve"/>
             </w:r>
           </w:p>
         </w:tc>
@@ -2271,6 +2323,7 @@
                 <w:sz w:val="19"/>
                 <w:szCs w:val="19"/>
               </w:rPr>
+              <w:t xml:space="preserve"/>
             </w:r>
           </w:p>
         </w:tc>
@@ -2318,6 +2371,7 @@
                 <w:sz w:val="19"/>
                 <w:szCs w:val="19"/>
               </w:rPr>
+              <w:t xml:space="preserve"/>
             </w:r>
           </w:p>
         </w:tc>
@@ -2340,6 +2394,7 @@
                 <w:sz w:val="19"/>
                 <w:szCs w:val="19"/>
               </w:rPr>
+              <w:t xml:space="preserve"/>
             </w:r>
           </w:p>
         </w:tc>
@@ -2362,6 +2417,7 @@
                 <w:sz w:val="19"/>
                 <w:szCs w:val="19"/>
               </w:rPr>
+              <w:t xml:space="preserve"/>
             </w:r>
           </w:p>
         </w:tc>
@@ -2384,6 +2440,7 @@
                 <w:sz w:val="19"/>
                 <w:szCs w:val="19"/>
               </w:rPr>
+              <w:t xml:space="preserve"/>
             </w:r>
           </w:p>
         </w:tc>
@@ -2406,6 +2463,7 @@
                 <w:sz w:val="19"/>
                 <w:szCs w:val="19"/>
               </w:rPr>
+              <w:t xml:space="preserve"/>
             </w:r>
           </w:p>
         </w:tc>
@@ -2453,6 +2511,7 @@
                 <w:sz w:val="19"/>
                 <w:szCs w:val="19"/>
               </w:rPr>
+              <w:t xml:space="preserve"/>
             </w:r>
           </w:p>
         </w:tc>
@@ -2475,6 +2534,7 @@
                 <w:sz w:val="19"/>
                 <w:szCs w:val="19"/>
               </w:rPr>
+              <w:t xml:space="preserve"/>
             </w:r>
           </w:p>
         </w:tc>
@@ -2497,6 +2557,7 @@
                 <w:sz w:val="19"/>
                 <w:szCs w:val="19"/>
               </w:rPr>
+              <w:t xml:space="preserve"/>
             </w:r>
           </w:p>
         </w:tc>
@@ -2519,6 +2580,7 @@
                 <w:sz w:val="19"/>
                 <w:szCs w:val="19"/>
               </w:rPr>
+              <w:t xml:space="preserve"/>
             </w:r>
           </w:p>
         </w:tc>
@@ -2541,6 +2603,7 @@
                 <w:sz w:val="19"/>
                 <w:szCs w:val="19"/>
               </w:rPr>
+              <w:t xml:space="preserve"/>
             </w:r>
           </w:p>
         </w:tc>
@@ -2588,6 +2651,7 @@
                 <w:sz w:val="19"/>
                 <w:szCs w:val="19"/>
               </w:rPr>
+              <w:t xml:space="preserve"/>
             </w:r>
           </w:p>
         </w:tc>
@@ -2610,6 +2674,7 @@
                 <w:sz w:val="19"/>
                 <w:szCs w:val="19"/>
               </w:rPr>
+              <w:t xml:space="preserve"/>
             </w:r>
           </w:p>
         </w:tc>
@@ -2632,6 +2697,7 @@
                 <w:sz w:val="19"/>
                 <w:szCs w:val="19"/>
               </w:rPr>
+              <w:t xml:space="preserve"/>
             </w:r>
           </w:p>
         </w:tc>
@@ -2654,6 +2720,7 @@
                 <w:sz w:val="19"/>
                 <w:szCs w:val="19"/>
               </w:rPr>
+              <w:t xml:space="preserve"/>
             </w:r>
           </w:p>
         </w:tc>
@@ -2676,6 +2743,7 @@
                 <w:sz w:val="19"/>
                 <w:szCs w:val="19"/>
               </w:rPr>
+              <w:t xml:space="preserve"/>
             </w:r>
           </w:p>
         </w:tc>
@@ -2723,6 +2791,7 @@
                 <w:sz w:val="19"/>
                 <w:szCs w:val="19"/>
               </w:rPr>
+              <w:t xml:space="preserve"/>
             </w:r>
           </w:p>
         </w:tc>
@@ -2745,6 +2814,7 @@
                 <w:sz w:val="19"/>
                 <w:szCs w:val="19"/>
               </w:rPr>
+              <w:t xml:space="preserve"/>
             </w:r>
           </w:p>
         </w:tc>
@@ -2767,6 +2837,7 @@
                 <w:sz w:val="19"/>
                 <w:szCs w:val="19"/>
               </w:rPr>
+              <w:t xml:space="preserve"/>
             </w:r>
           </w:p>
         </w:tc>
@@ -2789,6 +2860,7 @@
                 <w:sz w:val="19"/>
                 <w:szCs w:val="19"/>
               </w:rPr>
+              <w:t xml:space="preserve"/>
             </w:r>
           </w:p>
         </w:tc>
@@ -2811,6 +2883,7 @@
                 <w:sz w:val="19"/>
                 <w:szCs w:val="19"/>
               </w:rPr>
+              <w:t xml:space="preserve"/>
             </w:r>
           </w:p>
         </w:tc>
@@ -2858,6 +2931,7 @@
                 <w:sz w:val="19"/>
                 <w:szCs w:val="19"/>
               </w:rPr>
+              <w:t xml:space="preserve"/>
             </w:r>
           </w:p>
         </w:tc>
@@ -2880,6 +2954,7 @@
                 <w:sz w:val="19"/>
                 <w:szCs w:val="19"/>
               </w:rPr>
+              <w:t xml:space="preserve"/>
             </w:r>
           </w:p>
         </w:tc>
@@ -2902,6 +2977,7 @@
                 <w:sz w:val="19"/>
                 <w:szCs w:val="19"/>
               </w:rPr>
+              <w:t xml:space="preserve"/>
             </w:r>
           </w:p>
         </w:tc>
@@ -2924,6 +3000,7 @@
                 <w:sz w:val="19"/>
                 <w:szCs w:val="19"/>
               </w:rPr>
+              <w:t xml:space="preserve"/>
             </w:r>
           </w:p>
         </w:tc>
@@ -2946,6 +3023,7 @@
                 <w:sz w:val="19"/>
                 <w:szCs w:val="19"/>
               </w:rPr>
+              <w:t xml:space="preserve"/>
             </w:r>
           </w:p>
         </w:tc>
@@ -2993,6 +3071,7 @@
                 <w:sz w:val="19"/>
                 <w:szCs w:val="19"/>
               </w:rPr>
+              <w:t xml:space="preserve"/>
             </w:r>
           </w:p>
         </w:tc>
@@ -3015,6 +3094,7 @@
                 <w:sz w:val="19"/>
                 <w:szCs w:val="19"/>
               </w:rPr>
+              <w:t xml:space="preserve"/>
             </w:r>
           </w:p>
         </w:tc>
@@ -3037,6 +3117,7 @@
                 <w:sz w:val="19"/>
                 <w:szCs w:val="19"/>
               </w:rPr>
+              <w:t xml:space="preserve"/>
             </w:r>
           </w:p>
         </w:tc>
@@ -3059,6 +3140,7 @@
                 <w:sz w:val="19"/>
                 <w:szCs w:val="19"/>
               </w:rPr>
+              <w:t xml:space="preserve"/>
             </w:r>
           </w:p>
         </w:tc>
@@ -3081,6 +3163,7 @@
                 <w:sz w:val="19"/>
                 <w:szCs w:val="19"/>
               </w:rPr>
+              <w:t xml:space="preserve"/>
             </w:r>
           </w:p>
         </w:tc>
@@ -3128,6 +3211,7 @@
                 <w:sz w:val="19"/>
                 <w:szCs w:val="19"/>
               </w:rPr>
+              <w:t xml:space="preserve"/>
             </w:r>
           </w:p>
         </w:tc>
@@ -3150,6 +3234,7 @@
                 <w:sz w:val="19"/>
                 <w:szCs w:val="19"/>
               </w:rPr>
+              <w:t xml:space="preserve"/>
             </w:r>
           </w:p>
         </w:tc>
@@ -3172,6 +3257,7 @@
                 <w:sz w:val="19"/>
                 <w:szCs w:val="19"/>
               </w:rPr>
+              <w:t xml:space="preserve"/>
             </w:r>
           </w:p>
         </w:tc>
@@ -3194,6 +3280,7 @@
                 <w:sz w:val="19"/>
                 <w:szCs w:val="19"/>
               </w:rPr>
+              <w:t xml:space="preserve"/>
             </w:r>
           </w:p>
         </w:tc>
@@ -3216,6 +3303,7 @@
                 <w:sz w:val="19"/>
                 <w:szCs w:val="19"/>
               </w:rPr>
+              <w:t xml:space="preserve"/>
             </w:r>
           </w:p>
         </w:tc>
@@ -3263,6 +3351,7 @@
                 <w:sz w:val="19"/>
                 <w:szCs w:val="19"/>
               </w:rPr>
+              <w:t xml:space="preserve"/>
             </w:r>
           </w:p>
         </w:tc>
@@ -3285,6 +3374,7 @@
                 <w:sz w:val="19"/>
                 <w:szCs w:val="19"/>
               </w:rPr>
+              <w:t xml:space="preserve"/>
             </w:r>
           </w:p>
         </w:tc>
@@ -3307,6 +3397,7 @@
                 <w:sz w:val="19"/>
                 <w:szCs w:val="19"/>
               </w:rPr>
+              <w:t xml:space="preserve"/>
             </w:r>
           </w:p>
         </w:tc>
@@ -3329,6 +3420,7 @@
                 <w:sz w:val="19"/>
                 <w:szCs w:val="19"/>
               </w:rPr>
+              <w:t xml:space="preserve"/>
             </w:r>
           </w:p>
         </w:tc>
@@ -3351,6 +3443,7 @@
                 <w:sz w:val="19"/>
                 <w:szCs w:val="19"/>
               </w:rPr>
+              <w:t xml:space="preserve"/>
             </w:r>
           </w:p>
         </w:tc>
@@ -3398,6 +3491,7 @@
                 <w:sz w:val="19"/>
                 <w:szCs w:val="19"/>
               </w:rPr>
+              <w:t xml:space="preserve"/>
             </w:r>
           </w:p>
         </w:tc>
@@ -3420,6 +3514,7 @@
                 <w:sz w:val="19"/>
                 <w:szCs w:val="19"/>
               </w:rPr>
+              <w:t xml:space="preserve"/>
             </w:r>
           </w:p>
         </w:tc>
@@ -3442,6 +3537,7 @@
                 <w:sz w:val="19"/>
                 <w:szCs w:val="19"/>
               </w:rPr>
+              <w:t xml:space="preserve"/>
             </w:r>
           </w:p>
         </w:tc>
@@ -3464,6 +3560,7 @@
                 <w:sz w:val="19"/>
                 <w:szCs w:val="19"/>
               </w:rPr>
+              <w:t xml:space="preserve"/>
             </w:r>
           </w:p>
         </w:tc>
@@ -3486,6 +3583,7 @@
                 <w:sz w:val="19"/>
                 <w:szCs w:val="19"/>
               </w:rPr>
+              <w:t xml:space="preserve"/>
             </w:r>
           </w:p>
         </w:tc>
@@ -3533,6 +3631,7 @@
                 <w:sz w:val="19"/>
                 <w:szCs w:val="19"/>
               </w:rPr>
+              <w:t xml:space="preserve"/>
             </w:r>
           </w:p>
         </w:tc>
@@ -3555,6 +3654,7 @@
                 <w:sz w:val="19"/>
                 <w:szCs w:val="19"/>
               </w:rPr>
+              <w:t xml:space="preserve"/>
             </w:r>
           </w:p>
         </w:tc>
@@ -3577,6 +3677,7 @@
                 <w:sz w:val="19"/>
                 <w:szCs w:val="19"/>
               </w:rPr>
+              <w:t xml:space="preserve"/>
             </w:r>
           </w:p>
         </w:tc>
@@ -3599,6 +3700,7 @@
                 <w:sz w:val="19"/>
                 <w:szCs w:val="19"/>
               </w:rPr>
+              <w:t xml:space="preserve"/>
             </w:r>
           </w:p>
         </w:tc>
@@ -3621,6 +3723,7 @@
                 <w:sz w:val="19"/>
                 <w:szCs w:val="19"/>
               </w:rPr>
+              <w:t xml:space="preserve"/>
             </w:r>
           </w:p>
         </w:tc>
@@ -3668,6 +3771,7 @@
                 <w:sz w:val="19"/>
                 <w:szCs w:val="19"/>
               </w:rPr>
+              <w:t xml:space="preserve"/>
             </w:r>
           </w:p>
         </w:tc>
@@ -3690,6 +3794,7 @@
                 <w:sz w:val="19"/>
                 <w:szCs w:val="19"/>
               </w:rPr>
+              <w:t xml:space="preserve"/>
             </w:r>
           </w:p>
         </w:tc>
@@ -3712,6 +3817,7 @@
                 <w:sz w:val="19"/>
                 <w:szCs w:val="19"/>
               </w:rPr>
+              <w:t xml:space="preserve"/>
             </w:r>
           </w:p>
         </w:tc>
@@ -3734,6 +3840,7 @@
                 <w:sz w:val="19"/>
                 <w:szCs w:val="19"/>
               </w:rPr>
+              <w:t xml:space="preserve"/>
             </w:r>
           </w:p>
         </w:tc>
@@ -3756,6 +3863,7 @@
                 <w:sz w:val="19"/>
                 <w:szCs w:val="19"/>
               </w:rPr>
+              <w:t xml:space="preserve"/>
             </w:r>
           </w:p>
         </w:tc>
@@ -3803,6 +3911,7 @@
                 <w:sz w:val="19"/>
                 <w:szCs w:val="19"/>
               </w:rPr>
+              <w:t xml:space="preserve"/>
             </w:r>
           </w:p>
         </w:tc>
@@ -3825,6 +3934,7 @@
                 <w:sz w:val="19"/>
                 <w:szCs w:val="19"/>
               </w:rPr>
+              <w:t xml:space="preserve"/>
             </w:r>
           </w:p>
         </w:tc>
@@ -3847,6 +3957,7 @@
                 <w:sz w:val="19"/>
                 <w:szCs w:val="19"/>
               </w:rPr>
+              <w:t xml:space="preserve"/>
             </w:r>
           </w:p>
         </w:tc>
@@ -3869,6 +3980,7 @@
                 <w:sz w:val="19"/>
                 <w:szCs w:val="19"/>
               </w:rPr>
+              <w:t xml:space="preserve"/>
             </w:r>
           </w:p>
         </w:tc>
@@ -3891,6 +4003,7 @@
                 <w:sz w:val="19"/>
                 <w:szCs w:val="19"/>
               </w:rPr>
+              <w:t xml:space="preserve"/>
             </w:r>
           </w:p>
         </w:tc>
@@ -3938,6 +4051,7 @@
                 <w:sz w:val="19"/>
                 <w:szCs w:val="19"/>
               </w:rPr>
+              <w:t xml:space="preserve"/>
             </w:r>
           </w:p>
         </w:tc>
@@ -3960,6 +4074,7 @@
                 <w:sz w:val="19"/>
                 <w:szCs w:val="19"/>
               </w:rPr>
+              <w:t xml:space="preserve"/>
             </w:r>
           </w:p>
         </w:tc>
@@ -3982,6 +4097,7 @@
                 <w:sz w:val="19"/>
                 <w:szCs w:val="19"/>
               </w:rPr>
+              <w:t xml:space="preserve"/>
             </w:r>
           </w:p>
         </w:tc>
@@ -4004,6 +4120,7 @@
                 <w:sz w:val="19"/>
                 <w:szCs w:val="19"/>
               </w:rPr>
+              <w:t xml:space="preserve"/>
             </w:r>
           </w:p>
         </w:tc>
@@ -4026,6 +4143,7 @@
                 <w:sz w:val="19"/>
                 <w:szCs w:val="19"/>
               </w:rPr>
+              <w:t xml:space="preserve"/>
             </w:r>
           </w:p>
         </w:tc>
@@ -4073,6 +4191,7 @@
                 <w:sz w:val="19"/>
                 <w:szCs w:val="19"/>
               </w:rPr>
+              <w:t xml:space="preserve"/>
             </w:r>
           </w:p>
         </w:tc>
@@ -4095,6 +4214,7 @@
                 <w:sz w:val="19"/>
                 <w:szCs w:val="19"/>
               </w:rPr>
+              <w:t xml:space="preserve"/>
             </w:r>
           </w:p>
         </w:tc>
@@ -4117,6 +4237,7 @@
                 <w:sz w:val="19"/>
                 <w:szCs w:val="19"/>
               </w:rPr>
+              <w:t xml:space="preserve"/>
             </w:r>
           </w:p>
         </w:tc>
@@ -4139,6 +4260,7 @@
                 <w:sz w:val="19"/>
                 <w:szCs w:val="19"/>
               </w:rPr>
+              <w:t xml:space="preserve"/>
             </w:r>
           </w:p>
         </w:tc>
@@ -4161,6 +4283,7 @@
                 <w:sz w:val="19"/>
                 <w:szCs w:val="19"/>
               </w:rPr>
+              <w:t xml:space="preserve"/>
             </w:r>
           </w:p>
         </w:tc>
@@ -4208,6 +4331,7 @@
                 <w:sz w:val="19"/>
                 <w:szCs w:val="19"/>
               </w:rPr>
+              <w:t xml:space="preserve"/>
             </w:r>
           </w:p>
         </w:tc>
@@ -4230,6 +4354,7 @@
                 <w:sz w:val="19"/>
                 <w:szCs w:val="19"/>
               </w:rPr>
+              <w:t xml:space="preserve"/>
             </w:r>
           </w:p>
         </w:tc>
@@ -4252,6 +4377,7 @@
                 <w:sz w:val="19"/>
                 <w:szCs w:val="19"/>
               </w:rPr>
+              <w:t xml:space="preserve"/>
             </w:r>
           </w:p>
         </w:tc>
@@ -4274,6 +4400,7 @@
                 <w:sz w:val="19"/>
                 <w:szCs w:val="19"/>
               </w:rPr>
+              <w:t xml:space="preserve"/>
             </w:r>
           </w:p>
         </w:tc>
@@ -4296,6 +4423,7 @@
                 <w:sz w:val="19"/>
                 <w:szCs w:val="19"/>
               </w:rPr>
+              <w:t xml:space="preserve"/>
             </w:r>
           </w:p>
         </w:tc>
@@ -4343,6 +4471,7 @@
                 <w:sz w:val="19"/>
                 <w:szCs w:val="19"/>
               </w:rPr>
+              <w:t xml:space="preserve"/>
             </w:r>
           </w:p>
         </w:tc>
@@ -4365,6 +4494,7 @@
                 <w:sz w:val="19"/>
                 <w:szCs w:val="19"/>
               </w:rPr>
+              <w:t xml:space="preserve"/>
             </w:r>
           </w:p>
         </w:tc>
@@ -4387,6 +4517,7 @@
                 <w:sz w:val="19"/>
                 <w:szCs w:val="19"/>
               </w:rPr>
+              <w:t xml:space="preserve"/>
             </w:r>
           </w:p>
         </w:tc>
@@ -4409,6 +4540,7 @@
                 <w:sz w:val="19"/>
                 <w:szCs w:val="19"/>
               </w:rPr>
+              <w:t xml:space="preserve"/>
             </w:r>
           </w:p>
         </w:tc>
@@ -4431,6 +4563,7 @@
                 <w:sz w:val="19"/>
                 <w:szCs w:val="19"/>
               </w:rPr>
+              <w:t xml:space="preserve"/>
             </w:r>
           </w:p>
         </w:tc>
@@ -4478,6 +4611,7 @@
                 <w:sz w:val="19"/>
                 <w:szCs w:val="19"/>
               </w:rPr>
+              <w:t xml:space="preserve"/>
             </w:r>
           </w:p>
         </w:tc>
@@ -4500,6 +4634,7 @@
                 <w:sz w:val="19"/>
                 <w:szCs w:val="19"/>
               </w:rPr>
+              <w:t xml:space="preserve"/>
             </w:r>
           </w:p>
         </w:tc>
@@ -4522,6 +4657,7 @@
                 <w:sz w:val="19"/>
                 <w:szCs w:val="19"/>
               </w:rPr>
+              <w:t xml:space="preserve"/>
             </w:r>
           </w:p>
         </w:tc>
@@ -4544,6 +4680,7 @@
                 <w:sz w:val="19"/>
                 <w:szCs w:val="19"/>
               </w:rPr>
+              <w:t xml:space="preserve"/>
             </w:r>
           </w:p>
         </w:tc>
@@ -4566,6 +4703,7 @@
                 <w:sz w:val="19"/>
                 <w:szCs w:val="19"/>
               </w:rPr>
+              <w:t xml:space="preserve"/>
             </w:r>
           </w:p>
         </w:tc>
@@ -4613,6 +4751,7 @@
                 <w:sz w:val="19"/>
                 <w:szCs w:val="19"/>
               </w:rPr>
+              <w:t xml:space="preserve"/>
             </w:r>
           </w:p>
         </w:tc>
@@ -4635,6 +4774,7 @@
                 <w:sz w:val="19"/>
                 <w:szCs w:val="19"/>
               </w:rPr>
+              <w:t xml:space="preserve"/>
             </w:r>
           </w:p>
         </w:tc>
@@ -4657,6 +4797,7 @@
                 <w:sz w:val="19"/>
                 <w:szCs w:val="19"/>
               </w:rPr>
+              <w:t xml:space="preserve"/>
             </w:r>
           </w:p>
         </w:tc>
@@ -4679,6 +4820,7 @@
                 <w:sz w:val="19"/>
                 <w:szCs w:val="19"/>
               </w:rPr>
+              <w:t xml:space="preserve"/>
             </w:r>
           </w:p>
         </w:tc>
@@ -4701,6 +4843,7 @@
                 <w:sz w:val="19"/>
                 <w:szCs w:val="19"/>
               </w:rPr>
+              <w:t xml:space="preserve"/>
             </w:r>
           </w:p>
         </w:tc>
@@ -4748,6 +4891,7 @@
                 <w:sz w:val="19"/>
                 <w:szCs w:val="19"/>
               </w:rPr>
+              <w:t xml:space="preserve"/>
             </w:r>
           </w:p>
         </w:tc>
@@ -4770,6 +4914,7 @@
                 <w:sz w:val="19"/>
                 <w:szCs w:val="19"/>
               </w:rPr>
+              <w:t xml:space="preserve"/>
             </w:r>
           </w:p>
         </w:tc>
@@ -4792,6 +4937,7 @@
                 <w:sz w:val="19"/>
                 <w:szCs w:val="19"/>
               </w:rPr>
+              <w:t xml:space="preserve"/>
             </w:r>
           </w:p>
         </w:tc>
@@ -4814,6 +4960,7 @@
                 <w:sz w:val="19"/>
                 <w:szCs w:val="19"/>
               </w:rPr>
+              <w:t xml:space="preserve"/>
             </w:r>
           </w:p>
         </w:tc>
@@ -4836,6 +4983,7 @@
                 <w:sz w:val="19"/>
                 <w:szCs w:val="19"/>
               </w:rPr>
+              <w:t xml:space="preserve"/>
             </w:r>
           </w:p>
         </w:tc>
@@ -4864,7 +5012,7 @@
     <w:p>
       <w:pPr>
         <w:pStyle w:val="Heading1"/>
-        <w:spacing w:before="320" w:after="160"/>
+        <w:spacing w:after="160" w:before="320"/>
       </w:pPr>
       <w:r>
         <w:rPr>
@@ -5045,7 +5193,7 @@
     <w:p>
       <w:pPr>
         <w:pStyle w:val="Heading1"/>
-        <w:spacing w:before="320" w:after="160"/>
+        <w:spacing w:after="160" w:before="320"/>
       </w:pPr>
       <w:r>
         <w:rPr>
@@ -5188,6 +5336,7 @@
                 <w:sz w:val="19"/>
                 <w:szCs w:val="19"/>
               </w:rPr>
+              <w:t xml:space="preserve"/>
             </w:r>
           </w:p>
         </w:tc>
@@ -5210,6 +5359,7 @@
                 <w:sz w:val="19"/>
                 <w:szCs w:val="19"/>
               </w:rPr>
+              <w:t xml:space="preserve"/>
             </w:r>
           </w:p>
         </w:tc>
@@ -5232,6 +5382,7 @@
                 <w:sz w:val="19"/>
                 <w:szCs w:val="19"/>
               </w:rPr>
+              <w:t xml:space="preserve"/>
             </w:r>
           </w:p>
         </w:tc>
@@ -5256,6 +5407,7 @@
                 <w:sz w:val="19"/>
                 <w:szCs w:val="19"/>
               </w:rPr>
+              <w:t xml:space="preserve"/>
             </w:r>
           </w:p>
         </w:tc>
@@ -5278,6 +5430,7 @@
                 <w:sz w:val="19"/>
                 <w:szCs w:val="19"/>
               </w:rPr>
+              <w:t xml:space="preserve"/>
             </w:r>
           </w:p>
         </w:tc>
@@ -5300,6 +5453,7 @@
                 <w:sz w:val="19"/>
                 <w:szCs w:val="19"/>
               </w:rPr>
+              <w:t xml:space="preserve"/>
             </w:r>
           </w:p>
         </w:tc>
@@ -5324,6 +5478,7 @@
                 <w:sz w:val="19"/>
                 <w:szCs w:val="19"/>
               </w:rPr>
+              <w:t xml:space="preserve"/>
             </w:r>
           </w:p>
         </w:tc>
@@ -5346,6 +5501,7 @@
                 <w:sz w:val="19"/>
                 <w:szCs w:val="19"/>
               </w:rPr>
+              <w:t xml:space="preserve"/>
             </w:r>
           </w:p>
         </w:tc>
@@ -5368,6 +5524,7 @@
                 <w:sz w:val="19"/>
                 <w:szCs w:val="19"/>
               </w:rPr>
+              <w:t xml:space="preserve"/>
             </w:r>
           </w:p>
         </w:tc>
@@ -5392,6 +5549,7 @@
                 <w:sz w:val="19"/>
                 <w:szCs w:val="19"/>
               </w:rPr>
+              <w:t xml:space="preserve"/>
             </w:r>
           </w:p>
         </w:tc>
@@ -5414,6 +5572,7 @@
                 <w:sz w:val="19"/>
                 <w:szCs w:val="19"/>
               </w:rPr>
+              <w:t xml:space="preserve"/>
             </w:r>
           </w:p>
         </w:tc>
@@ -5436,6 +5595,7 @@
                 <w:sz w:val="19"/>
                 <w:szCs w:val="19"/>
               </w:rPr>
+              <w:t xml:space="preserve"/>
             </w:r>
           </w:p>
         </w:tc>
@@ -5460,6 +5620,7 @@
                 <w:sz w:val="19"/>
                 <w:szCs w:val="19"/>
               </w:rPr>
+              <w:t xml:space="preserve"/>
             </w:r>
           </w:p>
         </w:tc>
@@ -5482,6 +5643,7 @@
                 <w:sz w:val="19"/>
                 <w:szCs w:val="19"/>
               </w:rPr>
+              <w:t xml:space="preserve"/>
             </w:r>
           </w:p>
         </w:tc>
@@ -5504,6 +5666,7 @@
                 <w:sz w:val="19"/>
                 <w:szCs w:val="19"/>
               </w:rPr>
+              <w:t xml:space="preserve"/>
             </w:r>
           </w:p>
         </w:tc>
@@ -5528,6 +5691,7 @@
                 <w:sz w:val="19"/>
                 <w:szCs w:val="19"/>
               </w:rPr>
+              <w:t xml:space="preserve"/>
             </w:r>
           </w:p>
         </w:tc>
@@ -5550,6 +5714,7 @@
                 <w:sz w:val="19"/>
                 <w:szCs w:val="19"/>
               </w:rPr>
+              <w:t xml:space="preserve"/>
             </w:r>
           </w:p>
         </w:tc>
@@ -5572,6 +5737,7 @@
                 <w:sz w:val="19"/>
                 <w:szCs w:val="19"/>
               </w:rPr>
+              <w:t xml:space="preserve"/>
             </w:r>
           </w:p>
         </w:tc>
@@ -5596,6 +5762,7 @@
                 <w:sz w:val="19"/>
                 <w:szCs w:val="19"/>
               </w:rPr>
+              <w:t xml:space="preserve"/>
             </w:r>
           </w:p>
         </w:tc>
@@ -5618,6 +5785,7 @@
                 <w:sz w:val="19"/>
                 <w:szCs w:val="19"/>
               </w:rPr>
+              <w:t xml:space="preserve"/>
             </w:r>
           </w:p>
         </w:tc>
@@ -5640,6 +5808,7 @@
                 <w:sz w:val="19"/>
                 <w:szCs w:val="19"/>
               </w:rPr>
+              <w:t xml:space="preserve"/>
             </w:r>
           </w:p>
         </w:tc>
@@ -5664,6 +5833,7 @@
                 <w:sz w:val="19"/>
                 <w:szCs w:val="19"/>
               </w:rPr>
+              <w:t xml:space="preserve"/>
             </w:r>
           </w:p>
         </w:tc>
@@ -5686,6 +5856,7 @@
                 <w:sz w:val="19"/>
                 <w:szCs w:val="19"/>
               </w:rPr>
+              <w:t xml:space="preserve"/>
             </w:r>
           </w:p>
         </w:tc>
@@ -5708,6 +5879,7 @@
                 <w:sz w:val="19"/>
                 <w:szCs w:val="19"/>
               </w:rPr>
+              <w:t xml:space="preserve"/>
             </w:r>
           </w:p>
         </w:tc>
@@ -5736,7 +5908,7 @@
     <w:p>
       <w:pPr>
         <w:pStyle w:val="Heading1"/>
-        <w:spacing w:before="320" w:after="160"/>
+        <w:spacing w:after="160" w:before="320"/>
       </w:pPr>
       <w:r>
         <w:rPr>
@@ -5907,6 +6079,7 @@
                 <w:sz w:val="19"/>
                 <w:szCs w:val="19"/>
               </w:rPr>
+              <w:t xml:space="preserve"/>
             </w:r>
           </w:p>
         </w:tc>
@@ -5929,6 +6102,7 @@
                 <w:sz w:val="19"/>
                 <w:szCs w:val="19"/>
               </w:rPr>
+              <w:t xml:space="preserve"/>
             </w:r>
           </w:p>
         </w:tc>
@@ -5951,6 +6125,7 @@
                 <w:sz w:val="19"/>
                 <w:szCs w:val="19"/>
               </w:rPr>
+              <w:t xml:space="preserve"/>
             </w:r>
           </w:p>
         </w:tc>
@@ -5973,6 +6148,7 @@
                 <w:sz w:val="19"/>
                 <w:szCs w:val="19"/>
               </w:rPr>
+              <w:t xml:space="preserve"/>
             </w:r>
           </w:p>
         </w:tc>
@@ -5997,6 +6173,7 @@
                 <w:sz w:val="19"/>
                 <w:szCs w:val="19"/>
               </w:rPr>
+              <w:t xml:space="preserve"/>
             </w:r>
           </w:p>
         </w:tc>
@@ -6019,6 +6196,7 @@
                 <w:sz w:val="19"/>
                 <w:szCs w:val="19"/>
               </w:rPr>
+              <w:t xml:space="preserve"/>
             </w:r>
           </w:p>
         </w:tc>
@@ -6041,6 +6219,7 @@
                 <w:sz w:val="19"/>
                 <w:szCs w:val="19"/>
               </w:rPr>
+              <w:t xml:space="preserve"/>
             </w:r>
           </w:p>
         </w:tc>
@@ -6063,6 +6242,7 @@
                 <w:sz w:val="19"/>
                 <w:szCs w:val="19"/>
               </w:rPr>
+              <w:t xml:space="preserve"/>
             </w:r>
           </w:p>
         </w:tc>
@@ -6087,6 +6267,7 @@
                 <w:sz w:val="19"/>
                 <w:szCs w:val="19"/>
               </w:rPr>
+              <w:t xml:space="preserve"/>
             </w:r>
           </w:p>
         </w:tc>
@@ -6109,6 +6290,7 @@
                 <w:sz w:val="19"/>
                 <w:szCs w:val="19"/>
               </w:rPr>
+              <w:t xml:space="preserve"/>
             </w:r>
           </w:p>
         </w:tc>
@@ -6131,6 +6313,7 @@
                 <w:sz w:val="19"/>
                 <w:szCs w:val="19"/>
               </w:rPr>
+              <w:t xml:space="preserve"/>
             </w:r>
           </w:p>
         </w:tc>
@@ -6153,6 +6336,7 @@
                 <w:sz w:val="19"/>
                 <w:szCs w:val="19"/>
               </w:rPr>
+              <w:t xml:space="preserve"/>
             </w:r>
           </w:p>
         </w:tc>
@@ -6177,6 +6361,7 @@
                 <w:sz w:val="19"/>
                 <w:szCs w:val="19"/>
               </w:rPr>
+              <w:t xml:space="preserve"/>
             </w:r>
           </w:p>
         </w:tc>
@@ -6199,6 +6384,7 @@
                 <w:sz w:val="19"/>
                 <w:szCs w:val="19"/>
               </w:rPr>
+              <w:t xml:space="preserve"/>
             </w:r>
           </w:p>
         </w:tc>
@@ -6221,6 +6407,7 @@
                 <w:sz w:val="19"/>
                 <w:szCs w:val="19"/>
               </w:rPr>
+              <w:t xml:space="preserve"/>
             </w:r>
           </w:p>
         </w:tc>
@@ -6243,6 +6430,7 @@
                 <w:sz w:val="19"/>
                 <w:szCs w:val="19"/>
               </w:rPr>
+              <w:t xml:space="preserve"/>
             </w:r>
           </w:p>
         </w:tc>
@@ -6267,6 +6455,7 @@
                 <w:sz w:val="19"/>
                 <w:szCs w:val="19"/>
               </w:rPr>
+              <w:t xml:space="preserve"/>
             </w:r>
           </w:p>
         </w:tc>
@@ -6289,6 +6478,7 @@
                 <w:sz w:val="19"/>
                 <w:szCs w:val="19"/>
               </w:rPr>
+              <w:t xml:space="preserve"/>
             </w:r>
           </w:p>
         </w:tc>
@@ -6311,6 +6501,7 @@
                 <w:sz w:val="19"/>
                 <w:szCs w:val="19"/>
               </w:rPr>
+              <w:t xml:space="preserve"/>
             </w:r>
           </w:p>
         </w:tc>
@@ -6333,6 +6524,7 @@
                 <w:sz w:val="19"/>
                 <w:szCs w:val="19"/>
               </w:rPr>
+              <w:t xml:space="preserve"/>
             </w:r>
           </w:p>
         </w:tc>
@@ -6357,6 +6549,7 @@
                 <w:sz w:val="19"/>
                 <w:szCs w:val="19"/>
               </w:rPr>
+              <w:t xml:space="preserve"/>
             </w:r>
           </w:p>
         </w:tc>
@@ -6379,6 +6572,7 @@
                 <w:sz w:val="19"/>
                 <w:szCs w:val="19"/>
               </w:rPr>
+              <w:t xml:space="preserve"/>
             </w:r>
           </w:p>
         </w:tc>
@@ -6401,6 +6595,7 @@
                 <w:sz w:val="19"/>
                 <w:szCs w:val="19"/>
               </w:rPr>
+              <w:t xml:space="preserve"/>
             </w:r>
           </w:p>
         </w:tc>
@@ -6423,6 +6618,7 @@
                 <w:sz w:val="19"/>
                 <w:szCs w:val="19"/>
               </w:rPr>
+              <w:t xml:space="preserve"/>
             </w:r>
           </w:p>
         </w:tc>
@@ -6453,8 +6649,41 @@
 </w:document>
 </file>
 
-<file path=word/comments.xml><?xml version="1.0" encoding="utf-8"?>
-<w:comments xmlns:cx="http://schemas.microsoft.com/office/drawing/2014/chartex" xmlns:cx1="http://schemas.microsoft.com/office/drawing/2015/9/8/chartex" xmlns:cx2="http://schemas.microsoft.com/office/drawing/2015/10/21/chartex" xmlns:cx3="http://schemas.microsoft.com/office/drawing/2016/5/9/chartex" xmlns:cx4="http://schemas.microsoft.com/office/drawing/2016/5/10/chartex" xmlns:cx5="http://schemas.microsoft.com/office/drawing/2016/5/11/chartex" xmlns:cx6="http://schemas.microsoft.com/office/drawing/2016/5/12/chartex" xmlns:cx7="http://schemas.microsoft.com/office/drawing/2016/5/13/chartex" xmlns:cx8="http://schemas.microsoft.com/office/drawing/2016/5/14/chartex" xmlns:mc="http://schemas.openxmlformats.org/markup-compatibility/2006" xmlns:aink="http://schemas.microsoft.com/office/drawing/2016/ink" xmlns:am3d="http://schemas.microsoft.com/office/drawing/2017/model3d" xmlns:o="urn:schemas-microsoft-com:office:office" xmlns:r="http://schemas.openxmlformats.org/officeDocument/2006/relationships" xmlns:m="http://schemas.openxmlformats.org/officeDocument/2006/math" xmlns:v="urn:schemas-microsoft-com:vml" xmlns:wp14="http://schemas.microsoft.com/office/word/2010/wordprocessingDrawing" xmlns:wp="http://schemas.openxmlformats.org/drawingml/2006/wordprocessingDrawing" xmlns:w10="urn:schemas-microsoft-com:office:word" xmlns:w="http://schemas.openxmlformats.org/wordprocessingml/2006/main" xmlns:w14="http://schemas.microsoft.com/office/word/2010/wordml" xmlns:w15="http://schemas.microsoft.com/office/word/2012/wordml" xmlns:w16cex="http://schemas.microsoft.com/office/word/2018/wordml/cex" xmlns:w16cid="http://schemas.microsoft.com/office/word/2016/wordml/cid" xmlns:w16="http://schemas.microsoft.com/office/word/2018/wordml" xmlns:w16sdtdh="http://schemas.microsoft.com/office/word/2020/wordml/sdtdatahash" xmlns:w16se="http://schemas.microsoft.com/office/word/2015/wordml/symex" xmlns:wpg="http://schemas.microsoft.com/office/word/2010/wordprocessingGroup" xmlns:wpi="http://schemas.microsoft.com/office/word/2010/wordprocessingInk" xmlns:wne="http://schemas.microsoft.com/office/word/2006/wordml" xmlns:wps="http://schemas.microsoft.com/office/word/2010/wordprocessingShape"/>
+<file path=word/endnotes.xml><?xml version="1.0" encoding="utf-8"?>
+<w:endnotes xmlns:wpc="http://schemas.microsoft.com/office/word/2010/wordprocessingCanvas" xmlns:mc="http://schemas.openxmlformats.org/markup-compatibility/2006" xmlns:o="urn:schemas-microsoft-com:office:office" xmlns:r="http://schemas.openxmlformats.org/officeDocument/2006/relationships" xmlns:m="http://schemas.openxmlformats.org/officeDocument/2006/math" xmlns:v="urn:schemas-microsoft-com:vml" xmlns:wp14="http://schemas.microsoft.com/office/word/2010/wordprocessingDrawing" xmlns:wp="http://schemas.openxmlformats.org/drawingml/2006/wordprocessingDrawing" xmlns:w10="urn:schemas-microsoft-com:office:word" xmlns:w="http://schemas.openxmlformats.org/wordprocessingml/2006/main" xmlns:w14="http://schemas.microsoft.com/office/word/2010/wordml" xmlns:w15="http://schemas.microsoft.com/office/word/2012/wordml" xmlns:wpg="http://schemas.microsoft.com/office/word/2010/wordprocessingGroup" xmlns:wpi="http://schemas.microsoft.com/office/word/2010/wordprocessingInk" xmlns:wne="http://schemas.microsoft.com/office/word/2006/wordml" xmlns:wps="http://schemas.microsoft.com/office/word/2010/wordprocessingShape" mc:Ignorable="w14 w15 wp14">
+  <w:endnote w:type="separator" w:id="-1">
+    <w:p>
+      <w:pPr>
+        <w:spacing w:after="0" w:line="240" w:lineRule="auto"/>
+      </w:pPr>
+      <w:r>
+        <w:rPr>
+          <w:rStyle w:val="EndnoteReference"/>
+        </w:rPr>
+        <w:endnoteRef/>
+      </w:r>
+      <w:r>
+        <w:separator/>
+      </w:r>
+    </w:p>
+  </w:endnote>
+  <w:endnote w:type="continuationSeparator" w:id="0">
+    <w:p>
+      <w:pPr>
+        <w:spacing w:after="0" w:line="240" w:lineRule="auto"/>
+      </w:pPr>
+      <w:r>
+        <w:rPr>
+          <w:rStyle w:val="EndnoteReference"/>
+        </w:rPr>
+        <w:endnoteRef/>
+      </w:r>
+      <w:r>
+        <w:continuationSeparator/>
+      </w:r>
+    </w:p>
+  </w:endnote>
+</w:endnotes>
 </file>
 
 <file path=word/footnotes.xml><?xml version="1.0" encoding="utf-8"?>
@@ -6498,7 +6727,7 @@
 <w:numbering xmlns:wpc="http://schemas.microsoft.com/office/word/2010/wordprocessingCanvas" xmlns:mc="http://schemas.openxmlformats.org/markup-compatibility/2006" xmlns:o="urn:schemas-microsoft-com:office:office" xmlns:r="http://schemas.openxmlformats.org/officeDocument/2006/relationships" xmlns:m="http://schemas.openxmlformats.org/officeDocument/2006/math" xmlns:v="urn:schemas-microsoft-com:vml" xmlns:wp14="http://schemas.microsoft.com/office/word/2010/wordprocessingDrawing" xmlns:wp="http://schemas.openxmlformats.org/drawingml/2006/wordprocessingDrawing" xmlns:w10="urn:schemas-microsoft-com:office:word" xmlns:w="http://schemas.openxmlformats.org/wordprocessingml/2006/main" xmlns:w14="http://schemas.microsoft.com/office/word/2010/wordml" xmlns:w15="http://schemas.microsoft.com/office/word/2012/wordml" xmlns:wpg="http://schemas.microsoft.com/office/word/2010/wordprocessingGroup" xmlns:wpi="http://schemas.microsoft.com/office/word/2010/wordprocessingInk" xmlns:wne="http://schemas.microsoft.com/office/word/2006/wordml" xmlns:wps="http://schemas.microsoft.com/office/word/2010/wordprocessingShape" mc:Ignorable="w14 w15 wp14">
   <w:abstractNum w:abstractNumId="1" w15:restartNumberingAfterBreak="0">
     <w:multiLevelType w:val="hybridMultilevel"/>
-    <w:lvl w:ilvl="0" w15:tentative="1">
+    <w:lvl w:ilvl="0" w:tentative="1">
       <w:start w:val="1"/>
       <w:numFmt w:val="bullet"/>
       <w:lvlText w:val="●"/>
@@ -6507,7 +6736,7 @@
         <w:ind w:left="720" w:hanging="360"/>
       </w:pPr>
     </w:lvl>
-    <w:lvl w:ilvl="1" w15:tentative="1">
+    <w:lvl w:ilvl="1" w:tentative="1">
       <w:start w:val="1"/>
       <w:numFmt w:val="bullet"/>
       <w:lvlText w:val="○"/>
@@ -6516,7 +6745,7 @@
         <w:ind w:left="1440" w:hanging="360"/>
       </w:pPr>
     </w:lvl>
-    <w:lvl w:ilvl="2" w15:tentative="1">
+    <w:lvl w:ilvl="2" w:tentative="1">
       <w:start w:val="1"/>
       <w:numFmt w:val="bullet"/>
       <w:lvlText w:val="■"/>
@@ -6525,7 +6754,7 @@
         <w:ind w:left="2160" w:hanging="360"/>
       </w:pPr>
     </w:lvl>
-    <w:lvl w:ilvl="3" w15:tentative="1">
+    <w:lvl w:ilvl="3" w:tentative="1">
       <w:start w:val="1"/>
       <w:numFmt w:val="bullet"/>
       <w:lvlText w:val="●"/>
@@ -6534,7 +6763,7 @@
         <w:ind w:left="2880" w:hanging="360"/>
       </w:pPr>
     </w:lvl>
-    <w:lvl w:ilvl="4" w15:tentative="1">
+    <w:lvl w:ilvl="4" w:tentative="1">
       <w:start w:val="1"/>
       <w:numFmt w:val="bullet"/>
       <w:lvlText w:val="○"/>
@@ -6543,7 +6772,7 @@
         <w:ind w:left="3600" w:hanging="360"/>
       </w:pPr>
     </w:lvl>
-    <w:lvl w:ilvl="5" w15:tentative="1">
+    <w:lvl w:ilvl="5" w:tentative="1">
       <w:start w:val="1"/>
       <w:numFmt w:val="bullet"/>
       <w:lvlText w:val="■"/>
@@ -6552,7 +6781,7 @@
         <w:ind w:left="4320" w:hanging="360"/>
       </w:pPr>
     </w:lvl>
-    <w:lvl w:ilvl="6" w15:tentative="1">
+    <w:lvl w:ilvl="6" w:tentative="1">
       <w:start w:val="1"/>
       <w:numFmt w:val="bullet"/>
       <w:lvlText w:val="●"/>
@@ -6561,7 +6790,7 @@
         <w:ind w:left="5040" w:hanging="360"/>
       </w:pPr>
     </w:lvl>
-    <w:lvl w:ilvl="7" w15:tentative="1">
+    <w:lvl w:ilvl="7" w:tentative="1">
       <w:start w:val="1"/>
       <w:numFmt w:val="bullet"/>
       <w:lvlText w:val="●"/>
@@ -6570,7 +6799,7 @@
         <w:ind w:left="5760" w:hanging="360"/>
       </w:pPr>
     </w:lvl>
-    <w:lvl w:ilvl="8" w15:tentative="1">
+    <w:lvl w:ilvl="8" w:tentative="1">
       <w:start w:val="1"/>
       <w:numFmt w:val="bullet"/>
       <w:lvlText w:val="●"/>
@@ -6594,13 +6823,17 @@
   <w:docDefaults>
     <w:rPrDefault>
       <w:rPr>
+        <w:rFonts w:ascii="Calibri" w:cs="Calibri" w:eastAsia="Calibri" w:hAnsi="Calibri"/>
         <w:sz w:val="21"/>
         <w:szCs w:val="21"/>
-        <w:rFonts w:ascii="Calibri" w:cs="Calibri" w:eastAsia="Calibri" w:hAnsi="Calibri"/>
       </w:rPr>
     </w:rPrDefault>
     <w:pPrDefault/>
   </w:docDefaults>
+  <w:style w:type="paragraph" w:styleId="Normal" w:default="1">
+    <w:name w:val="Normal"/>
+    <w:qFormat/>
+  </w:style>
   <w:style w:type="paragraph" w:styleId="Title">
     <w:name w:val="Title"/>
     <w:basedOn w:val="Normal"/>
@@ -6694,8 +6927,8 @@
     <w:uiPriority w:val="99"/>
     <w:unhideWhenUsed/>
     <w:rPr>
+      <w:color w:val="0563C1"/>
       <w:u w:val="single"/>
-      <w:color w:val="0563C1"/>
     </w:rPr>
   </w:style>
   <w:style w:type="character" w:styleId="FootnoteReference">
@@ -6735,5 +6968,332 @@
       <w:szCs w:val="20"/>
     </w:rPr>
   </w:style>
+  <w:style w:type="character" w:styleId="EndnoteReference">
+    <w:name w:val="endnote reference"/>
+    <w:basedOn w:val="DefaultParagraphFont"/>
+    <w:uiPriority w:val="99"/>
+    <w:semiHidden/>
+    <w:unhideWhenUsed/>
+    <w:rPr>
+      <w:vertAlign w:val="superscript"/>
+    </w:rPr>
+  </w:style>
+  <w:style w:type="paragraph" w:styleId="EndnoteText">
+    <w:name w:val="endnote text"/>
+    <w:basedOn w:val="Normal"/>
+    <w:link w:val="EndnoteTextChar"/>
+    <w:uiPriority w:val="99"/>
+    <w:semiHidden/>
+    <w:unhideWhenUsed/>
+    <w:pPr>
+      <w:spacing w:after="0" w:line="240" w:lineRule="auto"/>
+    </w:pPr>
+    <w:rPr>
+      <w:sz w:val="20"/>
+      <w:szCs w:val="20"/>
+    </w:rPr>
+  </w:style>
+  <w:style w:type="character" w:styleId="EndnoteTextChar">
+    <w:name w:val="Endnote Text Char"/>
+    <w:basedOn w:val="DefaultParagraphFont"/>
+    <w:link w:val="EndnoteText"/>
+    <w:uiPriority w:val="99"/>
+    <w:semiHidden/>
+    <w:unhideWhenUsed/>
+    <w:rPr>
+      <w:sz w:val="20"/>
+      <w:szCs w:val="20"/>
+    </w:rPr>
+  </w:style>
 </w:styles>
+</file>
+
+<file path=word/theme/theme1.xml><?xml version="1.0" encoding="utf-8"?>
+<a:theme xmlns:a="http://schemas.openxmlformats.org/drawingml/2006/main" name="Office Theme">
+  <a:themeElements>
+    <a:clrScheme name="Office">
+      <a:dk1>
+        <a:sysClr val="windowText" lastClr="000000"/>
+      </a:dk1>
+      <a:lt1>
+        <a:sysClr val="window" lastClr="FFFFFF"/>
+      </a:lt1>
+      <a:dk2>
+        <a:srgbClr val="44546A"/>
+      </a:dk2>
+      <a:lt2>
+        <a:srgbClr val="E7E6E6"/>
+      </a:lt2>
+      <a:accent1>
+        <a:srgbClr val="4472C4"/>
+      </a:accent1>
+      <a:accent2>
+        <a:srgbClr val="ED7D31"/>
+      </a:accent2>
+      <a:accent3>
+        <a:srgbClr val="A5A5A5"/>
+      </a:accent3>
+      <a:accent4>
+        <a:srgbClr val="FFC000"/>
+      </a:accent4>
+      <a:accent5>
+        <a:srgbClr val="5B9BD5"/>
+      </a:accent5>
+      <a:accent6>
+        <a:srgbClr val="70AD47"/>
+      </a:accent6>
+      <a:hlink>
+        <a:srgbClr val="0563C1"/>
+      </a:hlink>
+      <a:folHlink>
+        <a:srgbClr val="954F72"/>
+      </a:folHlink>
+    </a:clrScheme>
+    <a:fontScheme name="Office">
+      <a:majorFont>
+        <a:latin typeface="Calibri Light" panose="020F0302020204030204"/>
+        <a:ea typeface=""/>
+        <a:cs typeface=""/>
+        <a:font script="Jpan" typeface="游ゴシック Light"/>
+        <a:font script="Hang" typeface="맑은 고딕"/>
+        <a:font script="Hans" typeface="等线 Light"/>
+        <a:font script="Hant" typeface="新細明體"/>
+        <a:font script="Arab" typeface="Times New Roman"/>
+        <a:font script="Hebr" typeface="Times New Roman"/>
+        <a:font script="Thai" typeface="Angsana New"/>
+        <a:font script="Ethi" typeface="Nyala"/>
+        <a:font script="Beng" typeface="Vrinda"/>
+        <a:font script="Gujr" typeface="Shruti"/>
+        <a:font script="Khmr" typeface="MoolBoran"/>
+        <a:font script="Knda" typeface="Tunga"/>
+        <a:font script="Guru" typeface="Raavi"/>
+        <a:font script="Cans" typeface="Euphemia"/>
+        <a:font script="Cher" typeface="Plantagenet Cherokee"/>
+        <a:font script="Yiii" typeface="Microsoft Yi Baiti"/>
+        <a:font script="Tibt" typeface="Microsoft Himalaya"/>
+        <a:font script="Thaa" typeface="MV Boli"/>
+        <a:font script="Deva" typeface="Mangal"/>
+        <a:font script="Telu" typeface="Gautami"/>
+        <a:font script="Taml" typeface="Latha"/>
+        <a:font script="Syrc" typeface="Estrangelo Edessa"/>
+        <a:font script="Orya" typeface="Kalinga"/>
+        <a:font script="Mlym" typeface="Kartika"/>
+        <a:font script="Laoo" typeface="DokChampa"/>
+        <a:font script="Sinh" typeface="Iskoola Pota"/>
+        <a:font script="Mong" typeface="Mongolian Baiti"/>
+        <a:font script="Viet" typeface="Times New Roman"/>
+        <a:font script="Uigh" typeface="Microsoft Uighur"/>
+        <a:font script="Geor" typeface="Sylfaen"/>
+        <a:font script="Armn" typeface="Arial"/>
+        <a:font script="Bugi" typeface="Leelawadee UI"/>
+        <a:font script="Bopo" typeface="Microsoft JhengHei"/>
+        <a:font script="Java" typeface="Javanese Text"/>
+        <a:font script="Lisu" typeface="Segoe UI"/>
+        <a:font script="Mymr" typeface="Myanmar Text"/>
+        <a:font script="Nkoo" typeface="Ebrima"/>
+        <a:font script="Olck" typeface="Nirmala UI"/>
+        <a:font script="Osma" typeface="Ebrima"/>
+        <a:font script="Phag" typeface="Phagspa"/>
+        <a:font script="Syrn" typeface="Estrangelo Edessa"/>
+        <a:font script="Syrj" typeface="Estrangelo Edessa"/>
+        <a:font script="Syre" typeface="Estrangelo Edessa"/>
+        <a:font script="Sora" typeface="Nirmala UI"/>
+        <a:font script="Tale" typeface="Microsoft Tai Le"/>
+        <a:font script="Talu" typeface="Microsoft New Tai Lue"/>
+        <a:font script="Tfng" typeface="Ebrima"/>
+      </a:majorFont>
+      <a:minorFont>
+        <a:latin typeface="Calibri" panose="020F0502020204030204"/>
+        <a:ea typeface=""/>
+        <a:cs typeface=""/>
+        <a:font script="Jpan" typeface="游明朝"/>
+        <a:font script="Hang" typeface="맑은 고딕"/>
+        <a:font script="Hans" typeface="等线"/>
+        <a:font script="Hant" typeface="新細明體"/>
+        <a:font script="Arab" typeface="Arial"/>
+        <a:font script="Hebr" typeface="Arial"/>
+        <a:font script="Thai" typeface="Cordia New"/>
+        <a:font script="Ethi" typeface="Nyala"/>
+        <a:font script="Beng" typeface="Vrinda"/>
+        <a:font script="Gujr" typeface="Shruti"/>
+        <a:font script="Khmr" typeface="DaunPenh"/>
+        <a:font script="Knda" typeface="Tunga"/>
+        <a:font script="Guru" typeface="Raavi"/>
+        <a:font script="Cans" typeface="Euphemia"/>
+        <a:font script="Cher" typeface="Plantagenet Cherokee"/>
+        <a:font script="Yiii" typeface="Microsoft Yi Baiti"/>
+        <a:font script="Tibt" typeface="Microsoft Himalaya"/>
+        <a:font script="Thaa" typeface="MV Boli"/>
+        <a:font script="Deva" typeface="Mangal"/>
+        <a:font script="Telu" typeface="Gautami"/>
+        <a:font script="Taml" typeface="Latha"/>
+        <a:font script="Syrc" typeface="Estrangelo Edessa"/>
+        <a:font script="Orya" typeface="Kalinga"/>
+        <a:font script="Mlym" typeface="Kartika"/>
+        <a:font script="Laoo" typeface="DokChampa"/>
+        <a:font script="Sinh" typeface="Iskoola Pota"/>
+        <a:font script="Mong" typeface="Mongolian Baiti"/>
+        <a:font script="Viet" typeface="Arial"/>
+        <a:font script="Uigh" typeface="Microsoft Uighur"/>
+        <a:font script="Geor" typeface="Sylfaen"/>
+        <a:font script="Armn" typeface="Arial"/>
+        <a:font script="Bugi" typeface="Leelawadee UI"/>
+        <a:font script="Bopo" typeface="Microsoft JhengHei"/>
+        <a:font script="Java" typeface="Javanese Text"/>
+        <a:font script="Lisu" typeface="Segoe UI"/>
+        <a:font script="Mymr" typeface="Myanmar Text"/>
+        <a:font script="Nkoo" typeface="Ebrima"/>
+        <a:font script="Olck" typeface="Nirmala UI"/>
+        <a:font script="Osma" typeface="Ebrima"/>
+        <a:font script="Phag" typeface="Phagspa"/>
+        <a:font script="Syrn" typeface="Estrangelo Edessa"/>
+        <a:font script="Syrj" typeface="Estrangelo Edessa"/>
+        <a:font script="Syre" typeface="Estrangelo Edessa"/>
+        <a:font script="Sora" typeface="Nirmala UI"/>
+        <a:font script="Tale" typeface="Microsoft Tai Le"/>
+        <a:font script="Talu" typeface="Microsoft New Tai Lue"/>
+        <a:font script="Tfng" typeface="Ebrima"/>
+      </a:minorFont>
+    </a:fontScheme>
+    <a:fmtScheme name="Office">
+      <a:fillStyleLst>
+        <a:solidFill>
+          <a:schemeClr val="phClr"/>
+        </a:solidFill>
+        <a:gradFill rotWithShape="true">
+          <a:gsLst>
+            <a:gs pos="0">
+              <a:schemeClr val="phClr">
+                <a:lumMod val="110000"/>
+                <a:satMod val="105000"/>
+                <a:tint val="67000"/>
+              </a:schemeClr>
+            </a:gs>
+            <a:gs pos="50000">
+              <a:schemeClr val="phClr">
+                <a:lumMod val="105000"/>
+                <a:satMod val="103000"/>
+                <a:tint val="73000"/>
+              </a:schemeClr>
+            </a:gs>
+            <a:gs pos="100000">
+              <a:schemeClr val="phClr">
+                <a:lumMod val="105000"/>
+                <a:satMod val="109000"/>
+                <a:tint val="81000"/>
+              </a:schemeClr>
+            </a:gs>
+          </a:gsLst>
+          <a:lin ang="5400000" scaled="false"/>
+        </a:gradFill>
+        <a:gradFill rotWithShape="true">
+          <a:gsLst>
+            <a:gs pos="0">
+              <a:schemeClr val="phClr">
+                <a:satMod val="103000"/>
+                <a:lumMod val="102000"/>
+                <a:tint val="94000"/>
+              </a:schemeClr>
+            </a:gs>
+            <a:gs pos="50000">
+              <a:schemeClr val="phClr">
+                <a:satMod val="110000"/>
+                <a:lumMod val="100000"/>
+                <a:shade val="100000"/>
+              </a:schemeClr>
+            </a:gs>
+            <a:gs pos="100000">
+              <a:schemeClr val="phClr">
+                <a:lumMod val="99000"/>
+                <a:satMod val="120000"/>
+                <a:shade val="78000"/>
+              </a:schemeClr>
+            </a:gs>
+          </a:gsLst>
+          <a:lin ang="5400000" scaled="false"/>
+        </a:gradFill>
+      </a:fillStyleLst>
+      <a:lnStyleLst>
+        <a:ln w="6350" cap="flat" cmpd="sng" algn="ctr">
+          <a:solidFill>
+            <a:schemeClr val="phClr"/>
+          </a:solidFill>
+          <a:prstDash val="solid"/>
+          <a:miter lim="800000"/>
+        </a:ln>
+        <a:ln w="12700" cap="flat" cmpd="sng" algn="ctr">
+          <a:solidFill>
+            <a:schemeClr val="phClr"/>
+          </a:solidFill>
+          <a:prstDash val="solid"/>
+          <a:miter lim="800000"/>
+        </a:ln>
+        <a:ln w="19050" cap="flat" cmpd="sng" algn="ctr">
+          <a:solidFill>
+            <a:schemeClr val="phClr"/>
+          </a:solidFill>
+          <a:prstDash val="solid"/>
+          <a:miter lim="800000"/>
+        </a:ln>
+      </a:lnStyleLst>
+      <a:effectStyleLst>
+        <a:effectStyle>
+          <a:effectLst/>
+        </a:effectStyle>
+        <a:effectStyle>
+          <a:effectLst/>
+        </a:effectStyle>
+        <a:effectStyle>
+          <a:effectLst>
+            <a:outerShdw blurRad="57150" dist="19050" dir="5400000" algn="ctr" rotWithShape="false">
+              <a:srgbClr val="000000">
+                <a:alpha val="63000"/>
+              </a:srgbClr>
+            </a:outerShdw>
+          </a:effectLst>
+        </a:effectStyle>
+      </a:effectStyleLst>
+      <a:bgFillStyleLst>
+        <a:solidFill>
+          <a:schemeClr val="phClr"/>
+        </a:solidFill>
+        <a:solidFill>
+          <a:schemeClr val="phClr">
+            <a:tint val="95000"/>
+            <a:satMod val="170000"/>
+          </a:schemeClr>
+        </a:solidFill>
+        <a:gradFill rotWithShape="true">
+          <a:gsLst>
+            <a:gs pos="0">
+              <a:schemeClr val="phClr">
+                <a:tint val="93000"/>
+                <a:satMod val="150000"/>
+                <a:shade val="98000"/>
+                <a:lumMod val="102000"/>
+              </a:schemeClr>
+            </a:gs>
+            <a:gs pos="50000">
+              <a:schemeClr val="phClr">
+                <a:tint val="98000"/>
+                <a:satMod val="130000"/>
+                <a:shade val="90000"/>
+                <a:lumMod val="103000"/>
+              </a:schemeClr>
+            </a:gs>
+            <a:gs pos="100000">
+              <a:schemeClr val="phClr">
+                <a:shade val="63000"/>
+                <a:satMod val="120000"/>
+              </a:schemeClr>
+            </a:gs>
+          </a:gsLst>
+          <a:lin ang="5400000" scaled="false"/>
+        </a:gradFill>
+      </a:bgFillStyleLst>
+    </a:fmtScheme>
+  </a:themeElements>
+  <a:objectDefaults/>
+  <a:extraClrSchemeLst/>
+</a:theme>
 </file>
</xml_diff>